<commit_message>
Cập nhật lại file dl tuần 2
</commit_message>
<xml_diff>
--- a/docs/tuan_2/draft/tran_phuc_khang/2_ApplicationDevelopment_QAs_v1.docx
+++ b/docs/tuan_2/draft/tran_phuc_khang/2_ApplicationDevelopment_QAs_v1.docx
@@ -65,7 +65,7 @@
     </w:p>
     <w:p>
       <w:pPr>
-        <w:pStyle w:val="12"/>
+        <w:pStyle w:val="13"/>
         <w:numPr>
           <w:ilvl w:val="0"/>
           <w:numId w:val="1"/>
@@ -91,7 +91,7 @@
     </w:p>
     <w:p>
       <w:pPr>
-        <w:pStyle w:val="12"/>
+        <w:pStyle w:val="13"/>
         <w:numPr>
           <w:ilvl w:val="0"/>
           <w:numId w:val="1"/>
@@ -117,7 +117,7 @@
     </w:p>
     <w:p>
       <w:pPr>
-        <w:pStyle w:val="12"/>
+        <w:pStyle w:val="13"/>
         <w:numPr>
           <w:ilvl w:val="0"/>
           <w:numId w:val="1"/>
@@ -143,7 +143,7 @@
     </w:p>
     <w:p>
       <w:pPr>
-        <w:pStyle w:val="12"/>
+        <w:pStyle w:val="13"/>
         <w:numPr>
           <w:ilvl w:val="0"/>
           <w:numId w:val="1"/>
@@ -169,7 +169,7 @@
     </w:p>
     <w:p>
       <w:pPr>
-        <w:pStyle w:val="12"/>
+        <w:pStyle w:val="13"/>
         <w:numPr>
           <w:ilvl w:val="0"/>
           <w:numId w:val="1"/>
@@ -257,7 +257,7 @@
     </w:p>
     <w:p>
       <w:pPr>
-        <w:pStyle w:val="12"/>
+        <w:pStyle w:val="13"/>
         <w:numPr>
           <w:ilvl w:val="0"/>
           <w:numId w:val="2"/>
@@ -284,7 +284,7 @@
     </w:p>
     <w:p>
       <w:pPr>
-        <w:pStyle w:val="12"/>
+        <w:pStyle w:val="13"/>
         <w:numPr>
           <w:ilvl w:val="0"/>
           <w:numId w:val="3"/>
@@ -310,7 +310,7 @@
     </w:p>
     <w:p>
       <w:pPr>
-        <w:pStyle w:val="12"/>
+        <w:pStyle w:val="13"/>
         <w:numPr>
           <w:ilvl w:val="0"/>
           <w:numId w:val="3"/>
@@ -367,8 +367,9 @@
     </w:p>
     <w:p>
       <w:pPr>
-        <w:pStyle w:val="12"/>
-        <w:numPr>
+        <w:pStyle w:val="13"/>
+        <w:numPr>
+          <w:ilvl w:val="0"/>
           <w:numId w:val="0"/>
         </w:numPr>
         <w:spacing w:after="120" w:line="240" w:lineRule="auto"/>
@@ -376,6 +377,8 @@
         <w:jc w:val="both"/>
         <w:rPr>
           <w:rFonts w:hint="default" w:ascii="Times New Roman" w:hAnsi="Times New Roman" w:eastAsia="Calibri" w:cs="Times New Roman"/>
+          <w:b w:val="0"/>
+          <w:bCs w:val="0"/>
           <w:color w:val="000000" w:themeColor="text1"/>
           <w:sz w:val="24"/>
           <w:szCs w:val="24"/>
@@ -398,7 +401,7 @@
             </w14:solidFill>
           </w14:textFill>
         </w:rPr>
-        <w:t>Lễ tân/thu ngân</w:t>
+        <w:t>Lễ tân</w:t>
       </w:r>
       <w:r>
         <w:rPr>
@@ -418,16 +421,29 @@
       <w:r>
         <w:rPr>
           <w:rFonts w:hint="default" w:ascii="Times New Roman" w:hAnsi="Times New Roman" w:eastAsia="Calibri" w:cs="Times New Roman"/>
-          <w:color w:val="000000" w:themeColor="text1"/>
-          <w:sz w:val="24"/>
-          <w:szCs w:val="24"/>
-          <w14:textFill>
-            <w14:solidFill>
-              <w14:schemeClr w14:val="tx1"/>
-            </w14:solidFill>
-          </w14:textFill>
-        </w:rPr>
-        <w:t>Kiểm tra chi phí; thông báo số tiền; thu tiền; lập phiếu thu; ghi nhận công nợ và lịch thanh toán tiếp theo.</w:t>
+          <w:b w:val="0"/>
+          <w:bCs w:val="0"/>
+          <w:color w:val="000000" w:themeColor="text1"/>
+          <w:sz w:val="24"/>
+          <w:szCs w:val="24"/>
+          <w:lang w:val="en-US"/>
+          <w14:textFill>
+            <w14:solidFill>
+              <w14:schemeClr w14:val="tx1"/>
+            </w14:solidFill>
+          </w14:textFill>
+        </w:rPr>
+        <w:t xml:space="preserve"> </w:t>
+      </w:r>
+      <w:r>
+        <w:rPr>
+          <w:rFonts w:hint="default" w:ascii="Times New Roman" w:hAnsi="Times New Roman" w:eastAsia="SimSun" w:cs="Times New Roman"/>
+          <w:b w:val="0"/>
+          <w:bCs w:val="0"/>
+          <w:sz w:val="24"/>
+          <w:szCs w:val="24"/>
+        </w:rPr>
+        <w:t>Tiếp nhận bệnh nhân, quản lý thông tin bệnh nhân, quản lý lịch hẹn, check-in và điều phối bệnh nhân, hỗ trợ thanh toán, nhắc lịch/tái khám và bảo mật thông tin bệnh nhân.</w:t>
       </w:r>
     </w:p>
     <w:p>
@@ -478,8 +494,9 @@
     </w:p>
     <w:p>
       <w:pPr>
-        <w:pStyle w:val="12"/>
-        <w:numPr>
+        <w:pStyle w:val="13"/>
+        <w:numPr>
+          <w:ilvl w:val="0"/>
           <w:numId w:val="0"/>
         </w:numPr>
         <w:spacing w:after="120" w:line="240" w:lineRule="auto"/>
@@ -487,12 +504,12 @@
         <w:jc w:val="both"/>
         <w:rPr>
           <w:rFonts w:hint="default" w:ascii="Times New Roman" w:hAnsi="Times New Roman" w:eastAsia="Calibri" w:cs="Times New Roman"/>
-          <w:color w:val="000000" w:themeColor="text1"/>
-          <w:sz w:val="24"/>
-          <w:szCs w:val="24"/>
-          <w14:textFill>
-            <w14:solidFill>
-              <w14:schemeClr w14:val="tx1"/>
+          <w:color w:val="5B9BD5" w:themeColor="accent1"/>
+          <w:sz w:val="24"/>
+          <w:szCs w:val="24"/>
+          <w14:textFill>
+            <w14:solidFill>
+              <w14:schemeClr w14:val="accent1"/>
             </w14:solidFill>
           </w14:textFill>
         </w:rPr>
@@ -539,7 +556,67 @@
             </w14:solidFill>
           </w14:textFill>
         </w:rPr>
-        <w:t>Tổng phải thu = Tiền dịch vụ + Thuốc/vật tư tính riêng + Chi phí phát sinh + Thuế (nếu có) - Giảm giá - Bảo hiểm/hỗ trợ (nếu có). Số còn lại = Tổng phải thu - Tiền cọc - Các lần thanh toán trước.</w:t>
+        <w:t xml:space="preserve">Tổng phải thu = Tiền dịch vụ + Thuốc/vật tư tính riêng + Chi phí phát sinh + Thuế (nếu có) - Giảm giá - Bảo hiểm/hỗ trợ (nếu có). </w:t>
+      </w:r>
+    </w:p>
+    <w:p>
+      <w:pPr>
+        <w:pStyle w:val="13"/>
+        <w:numPr>
+          <w:ilvl w:val="0"/>
+          <w:numId w:val="0"/>
+        </w:numPr>
+        <w:spacing w:after="120" w:line="240" w:lineRule="auto"/>
+        <w:ind w:left="1440" w:leftChars="0" w:firstLine="720" w:firstLineChars="0"/>
+        <w:jc w:val="both"/>
+        <w:rPr>
+          <w:rFonts w:hint="default" w:ascii="Times New Roman" w:hAnsi="Times New Roman" w:eastAsia="Calibri" w:cs="Times New Roman"/>
+          <w:color w:val="5B9BD5" w:themeColor="accent1"/>
+          <w:sz w:val="24"/>
+          <w:szCs w:val="24"/>
+          <w14:textFill>
+            <w14:solidFill>
+              <w14:schemeClr w14:val="accent1"/>
+            </w14:solidFill>
+          </w14:textFill>
+        </w:rPr>
+      </w:pPr>
+    </w:p>
+    <w:p>
+      <w:pPr>
+        <w:pStyle w:val="13"/>
+        <w:numPr>
+          <w:ilvl w:val="0"/>
+          <w:numId w:val="0"/>
+        </w:numPr>
+        <w:spacing w:after="120" w:line="240" w:lineRule="auto"/>
+        <w:ind w:left="1440" w:leftChars="0" w:firstLine="720" w:firstLineChars="0"/>
+        <w:jc w:val="both"/>
+        <w:rPr>
+          <w:rFonts w:hint="default" w:ascii="Times New Roman" w:hAnsi="Times New Roman" w:eastAsia="Calibri" w:cs="Times New Roman"/>
+          <w:color w:val="000000" w:themeColor="text1"/>
+          <w:sz w:val="24"/>
+          <w:szCs w:val="24"/>
+          <w14:textFill>
+            <w14:solidFill>
+              <w14:schemeClr w14:val="tx1"/>
+            </w14:solidFill>
+          </w14:textFill>
+        </w:rPr>
+      </w:pPr>
+      <w:r>
+        <w:rPr>
+          <w:rFonts w:hint="default" w:ascii="Times New Roman" w:hAnsi="Times New Roman" w:eastAsia="Calibri" w:cs="Times New Roman"/>
+          <w:color w:val="5B9BD5" w:themeColor="accent1"/>
+          <w:sz w:val="24"/>
+          <w:szCs w:val="24"/>
+          <w14:textFill>
+            <w14:solidFill>
+              <w14:schemeClr w14:val="accent1"/>
+            </w14:solidFill>
+          </w14:textFill>
+        </w:rPr>
+        <w:t>Số còn lại = Tổng phải thu - Tiền cọc - Các lần thanh toán trước.</w:t>
       </w:r>
     </w:p>
     <w:p>
@@ -731,6 +808,8 @@
         </w:rPr>
         <w:t>. Quy trình thanh toán của lễ tân/thu ngân</w:t>
       </w:r>
+      <w:bookmarkStart w:id="0" w:name="_GoBack"/>
+      <w:bookmarkEnd w:id="0"/>
     </w:p>
     <w:p>
       <w:pPr>
@@ -741,16 +820,18 @@
         <w:suppressLineNumbers w:val="0"/>
         <w:ind w:firstLine="720" w:firstLineChars="0"/>
         <w:rPr>
-          <w:color w:val="000000" w:themeColor="text1"/>
-          <w14:textFill>
-            <w14:solidFill>
-              <w14:schemeClr w14:val="tx1"/>
-            </w14:solidFill>
-          </w14:textFill>
-        </w:rPr>
-      </w:pPr>
-      <w:r>
-        <w:rPr>
+          <w:rFonts w:hint="default" w:ascii="Times New Roman" w:hAnsi="Times New Roman" w:cs="Times New Roman"/>
+          <w:color w:val="000000" w:themeColor="text1"/>
+          <w14:textFill>
+            <w14:solidFill>
+              <w14:schemeClr w14:val="tx1"/>
+            </w14:solidFill>
+          </w14:textFill>
+        </w:rPr>
+      </w:pPr>
+      <w:r>
+        <w:rPr>
+          <w:rFonts w:hint="default" w:ascii="Times New Roman" w:hAnsi="Times New Roman" w:cs="Times New Roman"/>
           <w:color w:val="000000" w:themeColor="text1"/>
           <w14:textFill>
             <w14:solidFill>
@@ -763,119 +844,163 @@
     </w:p>
     <w:p>
       <w:pPr>
-        <w:pStyle w:val="9"/>
+        <w:pStyle w:val="10"/>
         <w:keepNext w:val="0"/>
         <w:keepLines w:val="0"/>
         <w:widowControl/>
         <w:suppressLineNumbers w:val="0"/>
         <w:ind w:left="720" w:leftChars="0" w:firstLine="720" w:firstLineChars="0"/>
-      </w:pPr>
-      <w:r>
-        <w:rPr>
-          <w:rStyle w:val="10"/>
+        <w:rPr>
+          <w:rFonts w:hint="default" w:ascii="Times New Roman" w:hAnsi="Times New Roman" w:cs="Times New Roman"/>
+        </w:rPr>
+      </w:pPr>
+      <w:r>
+        <w:rPr>
+          <w:rStyle w:val="11"/>
+          <w:rFonts w:hint="default" w:ascii="Times New Roman" w:hAnsi="Times New Roman" w:cs="Times New Roman"/>
         </w:rPr>
         <w:t>Bước 1: Tiếp nhận yêu cầu thanh toán</w:t>
       </w:r>
     </w:p>
     <w:p>
       <w:pPr>
-        <w:pStyle w:val="9"/>
+        <w:pStyle w:val="10"/>
         <w:keepNext w:val="0"/>
         <w:keepLines w:val="0"/>
         <w:widowControl/>
         <w:suppressLineNumbers w:val="0"/>
         <w:ind w:left="720" w:leftChars="0" w:firstLine="720" w:firstLineChars="0"/>
-      </w:pPr>
-      <w:r>
+        <w:rPr>
+          <w:rFonts w:hint="default" w:ascii="Times New Roman" w:hAnsi="Times New Roman" w:cs="Times New Roman"/>
+        </w:rPr>
+      </w:pPr>
+      <w:r>
+        <w:rPr>
+          <w:rFonts w:hint="default" w:ascii="Times New Roman" w:hAnsi="Times New Roman" w:cs="Times New Roman"/>
+        </w:rPr>
         <w:t>Sau khi bác sĩ xác nhận các dịch vụ đã thực hiện, lễ tân/thu ngân mở hồ sơ thanh toán của bệnh nhân trên hệ thống. Hệ thống hiển thị thông tin bệnh nhân, lần khám hoặc liệu trình, các dịch vụ đã thực hiện, đơn giá, số lượng và các khoản liên quan.</w:t>
       </w:r>
     </w:p>
     <w:p>
       <w:pPr>
-        <w:pStyle w:val="9"/>
+        <w:pStyle w:val="10"/>
         <w:keepNext w:val="0"/>
         <w:keepLines w:val="0"/>
         <w:widowControl/>
         <w:suppressLineNumbers w:val="0"/>
         <w:ind w:left="720" w:leftChars="0" w:firstLine="720" w:firstLineChars="0"/>
-      </w:pPr>
-      <w:r>
-        <w:rPr>
-          <w:rStyle w:val="10"/>
+        <w:rPr>
+          <w:rFonts w:hint="default" w:ascii="Times New Roman" w:hAnsi="Times New Roman" w:cs="Times New Roman"/>
+        </w:rPr>
+      </w:pPr>
+      <w:r>
+        <w:rPr>
+          <w:rStyle w:val="11"/>
+          <w:rFonts w:hint="default" w:ascii="Times New Roman" w:hAnsi="Times New Roman" w:cs="Times New Roman"/>
         </w:rPr>
         <w:t>Bước 2: Kiểm tra các dịch vụ được tính tiền</w:t>
       </w:r>
     </w:p>
     <w:p>
       <w:pPr>
-        <w:pStyle w:val="9"/>
+        <w:pStyle w:val="10"/>
         <w:keepNext w:val="0"/>
         <w:keepLines w:val="0"/>
         <w:widowControl/>
         <w:suppressLineNumbers w:val="0"/>
         <w:ind w:left="720" w:leftChars="0" w:firstLine="720" w:firstLineChars="0"/>
-      </w:pPr>
-      <w:r>
+        <w:rPr>
+          <w:rFonts w:hint="default" w:ascii="Times New Roman" w:hAnsi="Times New Roman" w:cs="Times New Roman"/>
+        </w:rPr>
+      </w:pPr>
+      <w:r>
+        <w:rPr>
+          <w:rFonts w:hint="default" w:ascii="Times New Roman" w:hAnsi="Times New Roman" w:cs="Times New Roman"/>
+        </w:rPr>
         <w:t xml:space="preserve">Lễ tân/thu ngân đối chiếu danh sách dịch vụ với thông tin điều trị đã được bác sĩ xác nhận. Chỉ các dịch vụ có trạng thái </w:t>
       </w:r>
       <w:r>
         <w:rPr>
-          <w:rStyle w:val="10"/>
+          <w:rStyle w:val="11"/>
+          <w:rFonts w:hint="default" w:ascii="Times New Roman" w:hAnsi="Times New Roman" w:cs="Times New Roman"/>
         </w:rPr>
         <w:t>“Đã thực hiện”</w:t>
       </w:r>
       <w:r>
+        <w:rPr>
+          <w:rFonts w:hint="default" w:ascii="Times New Roman" w:hAnsi="Times New Roman" w:cs="Times New Roman"/>
+        </w:rPr>
         <w:t xml:space="preserve"> hoặc </w:t>
       </w:r>
       <w:r>
         <w:rPr>
-          <w:rStyle w:val="10"/>
+          <w:rStyle w:val="11"/>
+          <w:rFonts w:hint="default" w:ascii="Times New Roman" w:hAnsi="Times New Roman" w:cs="Times New Roman"/>
         </w:rPr>
         <w:t>“Xác nhận phải thu”</w:t>
       </w:r>
       <w:r>
+        <w:rPr>
+          <w:rFonts w:hint="default" w:ascii="Times New Roman" w:hAnsi="Times New Roman" w:cs="Times New Roman"/>
+        </w:rPr>
         <w:t xml:space="preserve"> mới được đưa vào thanh toán. Dịch vụ chưa thực hiện, đã hủy hoặc nhập nhầm không được tính vào tổng chi phí.</w:t>
       </w:r>
     </w:p>
     <w:p>
       <w:pPr>
-        <w:pStyle w:val="9"/>
+        <w:pStyle w:val="10"/>
         <w:keepNext w:val="0"/>
         <w:keepLines w:val="0"/>
         <w:widowControl/>
         <w:suppressLineNumbers w:val="0"/>
         <w:ind w:left="720" w:leftChars="0" w:firstLine="720" w:firstLineChars="0"/>
-      </w:pPr>
-      <w:r>
+        <w:rPr>
+          <w:rFonts w:hint="default" w:ascii="Times New Roman" w:hAnsi="Times New Roman" w:cs="Times New Roman"/>
+        </w:rPr>
+      </w:pPr>
+      <w:r>
+        <w:rPr>
+          <w:rFonts w:hint="default" w:ascii="Times New Roman" w:hAnsi="Times New Roman" w:cs="Times New Roman"/>
+        </w:rPr>
         <w:t>Nếu phát hiện sai lệch về dịch vụ, số lượng, vị trí điều trị hoặc vật liệu sử dụng, lễ tân không được tự ý sửa thông tin chuyên môn mà phải chuyển lại cho bác sĩ hoặc người có thẩm quyền xác nhận.</w:t>
       </w:r>
     </w:p>
     <w:p>
       <w:pPr>
-        <w:pStyle w:val="9"/>
+        <w:pStyle w:val="10"/>
         <w:keepNext w:val="0"/>
         <w:keepLines w:val="0"/>
         <w:widowControl/>
         <w:suppressLineNumbers w:val="0"/>
         <w:ind w:left="720" w:leftChars="0" w:firstLine="720" w:firstLineChars="0"/>
-      </w:pPr>
-      <w:r>
-        <w:rPr>
-          <w:rStyle w:val="10"/>
+        <w:rPr>
+          <w:rFonts w:hint="default" w:ascii="Times New Roman" w:hAnsi="Times New Roman" w:cs="Times New Roman"/>
+        </w:rPr>
+      </w:pPr>
+      <w:r>
+        <w:rPr>
+          <w:rStyle w:val="11"/>
+          <w:rFonts w:hint="default" w:ascii="Times New Roman" w:hAnsi="Times New Roman" w:cs="Times New Roman"/>
         </w:rPr>
         <w:t>Bước 3: Xác định tổng số tiền phải thu</w:t>
       </w:r>
     </w:p>
     <w:p>
       <w:pPr>
-        <w:pStyle w:val="9"/>
+        <w:pStyle w:val="10"/>
         <w:keepNext w:val="0"/>
         <w:keepLines w:val="0"/>
         <w:widowControl/>
         <w:suppressLineNumbers w:val="0"/>
         <w:ind w:left="720" w:leftChars="0" w:firstLine="720" w:firstLineChars="0"/>
-      </w:pPr>
-      <w:r>
+        <w:rPr>
+          <w:rFonts w:hint="default" w:ascii="Times New Roman" w:hAnsi="Times New Roman" w:cs="Times New Roman"/>
+        </w:rPr>
+      </w:pPr>
+      <w:r>
+        <w:rPr>
+          <w:rFonts w:hint="default" w:ascii="Times New Roman" w:hAnsi="Times New Roman" w:cs="Times New Roman"/>
+        </w:rPr>
         <w:t>Hệ thống tự động tổng hợp:</w:t>
       </w:r>
     </w:p>
@@ -891,8 +1016,14 @@
         <w:suppressLineNumbers w:val="0"/>
         <w:spacing w:before="0" w:beforeAutospacing="1" w:after="0" w:afterAutospacing="1"/>
         <w:ind w:left="1560" w:leftChars="0" w:hanging="360"/>
-      </w:pPr>
-      <w:r>
+        <w:rPr>
+          <w:rFonts w:hint="default" w:ascii="Times New Roman" w:hAnsi="Times New Roman" w:cs="Times New Roman"/>
+        </w:rPr>
+      </w:pPr>
+      <w:r>
+        <w:rPr>
+          <w:rFonts w:hint="default" w:ascii="Times New Roman" w:hAnsi="Times New Roman" w:cs="Times New Roman"/>
+        </w:rPr>
         <w:t xml:space="preserve">Tiền dịch vụ đã thực hiện. </w:t>
       </w:r>
     </w:p>
@@ -908,8 +1039,14 @@
         <w:suppressLineNumbers w:val="0"/>
         <w:spacing w:before="0" w:beforeAutospacing="1" w:after="0" w:afterAutospacing="1"/>
         <w:ind w:left="1560" w:leftChars="0" w:hanging="360"/>
-      </w:pPr>
-      <w:r>
+        <w:rPr>
+          <w:rFonts w:hint="default" w:ascii="Times New Roman" w:hAnsi="Times New Roman" w:cs="Times New Roman"/>
+        </w:rPr>
+      </w:pPr>
+      <w:r>
+        <w:rPr>
+          <w:rFonts w:hint="default" w:ascii="Times New Roman" w:hAnsi="Times New Roman" w:cs="Times New Roman"/>
+        </w:rPr>
         <w:t xml:space="preserve">Tiền thuốc, vật tư hoặc sản phẩm tính riêng. </w:t>
       </w:r>
     </w:p>
@@ -925,8 +1062,14 @@
         <w:suppressLineNumbers w:val="0"/>
         <w:spacing w:before="0" w:beforeAutospacing="1" w:after="0" w:afterAutospacing="1"/>
         <w:ind w:left="1560" w:leftChars="0" w:hanging="360"/>
-      </w:pPr>
-      <w:r>
+        <w:rPr>
+          <w:rFonts w:hint="default" w:ascii="Times New Roman" w:hAnsi="Times New Roman" w:cs="Times New Roman"/>
+        </w:rPr>
+      </w:pPr>
+      <w:r>
+        <w:rPr>
+          <w:rFonts w:hint="default" w:ascii="Times New Roman" w:hAnsi="Times New Roman" w:cs="Times New Roman"/>
+        </w:rPr>
         <w:t xml:space="preserve">Chi phí phát sinh đã được xác nhận. </w:t>
       </w:r>
     </w:p>
@@ -942,8 +1085,14 @@
         <w:suppressLineNumbers w:val="0"/>
         <w:spacing w:before="0" w:beforeAutospacing="1" w:after="0" w:afterAutospacing="1"/>
         <w:ind w:left="1560" w:leftChars="0" w:hanging="360"/>
-      </w:pPr>
-      <w:r>
+        <w:rPr>
+          <w:rFonts w:hint="default" w:ascii="Times New Roman" w:hAnsi="Times New Roman" w:cs="Times New Roman"/>
+        </w:rPr>
+      </w:pPr>
+      <w:r>
+        <w:rPr>
+          <w:rFonts w:hint="default" w:ascii="Times New Roman" w:hAnsi="Times New Roman" w:cs="Times New Roman"/>
+        </w:rPr>
         <w:t xml:space="preserve">Thuế hoặc khoản phụ thu nếu có. </w:t>
       </w:r>
     </w:p>
@@ -959,8 +1108,14 @@
         <w:suppressLineNumbers w:val="0"/>
         <w:spacing w:before="0" w:beforeAutospacing="1" w:after="0" w:afterAutospacing="1"/>
         <w:ind w:left="1560" w:leftChars="0" w:hanging="360"/>
-      </w:pPr>
-      <w:r>
+        <w:rPr>
+          <w:rFonts w:hint="default" w:ascii="Times New Roman" w:hAnsi="Times New Roman" w:cs="Times New Roman"/>
+        </w:rPr>
+      </w:pPr>
+      <w:r>
+        <w:rPr>
+          <w:rFonts w:hint="default" w:ascii="Times New Roman" w:hAnsi="Times New Roman" w:cs="Times New Roman"/>
+        </w:rPr>
         <w:t xml:space="preserve">Khoản giảm giá, ưu đãi hoặc hỗ trợ. </w:t>
       </w:r>
     </w:p>
@@ -976,8 +1131,14 @@
         <w:suppressLineNumbers w:val="0"/>
         <w:spacing w:before="0" w:beforeAutospacing="1" w:after="0" w:afterAutospacing="1"/>
         <w:ind w:left="1560" w:leftChars="0" w:hanging="360"/>
-      </w:pPr>
-      <w:r>
+        <w:rPr>
+          <w:rFonts w:hint="default" w:ascii="Times New Roman" w:hAnsi="Times New Roman" w:cs="Times New Roman"/>
+        </w:rPr>
+      </w:pPr>
+      <w:r>
+        <w:rPr>
+          <w:rFonts w:hint="default" w:ascii="Times New Roman" w:hAnsi="Times New Roman" w:cs="Times New Roman"/>
+        </w:rPr>
         <w:t xml:space="preserve">Tiền cọc đã thu. </w:t>
       </w:r>
     </w:p>
@@ -993,92 +1154,130 @@
         <w:suppressLineNumbers w:val="0"/>
         <w:spacing w:before="0" w:beforeAutospacing="1" w:after="0" w:afterAutospacing="1"/>
         <w:ind w:left="1560" w:leftChars="0" w:hanging="360"/>
-      </w:pPr>
-      <w:r>
+        <w:rPr>
+          <w:rFonts w:hint="default" w:ascii="Times New Roman" w:hAnsi="Times New Roman" w:cs="Times New Roman"/>
+        </w:rPr>
+      </w:pPr>
+      <w:r>
+        <w:rPr>
+          <w:rFonts w:hint="default" w:ascii="Times New Roman" w:hAnsi="Times New Roman" w:cs="Times New Roman"/>
+        </w:rPr>
         <w:t xml:space="preserve">Các lần thanh toán trước. </w:t>
       </w:r>
     </w:p>
     <w:p>
       <w:pPr>
-        <w:pStyle w:val="9"/>
+        <w:pStyle w:val="10"/>
         <w:keepNext w:val="0"/>
         <w:keepLines w:val="0"/>
         <w:widowControl/>
         <w:suppressLineNumbers w:val="0"/>
         <w:ind w:left="720" w:leftChars="0" w:firstLine="720" w:firstLineChars="0"/>
-      </w:pPr>
-      <w:r>
+        <w:rPr>
+          <w:rFonts w:hint="default" w:ascii="Times New Roman" w:hAnsi="Times New Roman" w:cs="Times New Roman"/>
+        </w:rPr>
+      </w:pPr>
+      <w:r>
+        <w:rPr>
+          <w:rFonts w:hint="default" w:ascii="Times New Roman" w:hAnsi="Times New Roman" w:cs="Times New Roman"/>
+        </w:rPr>
         <w:t>Hệ thống tính và hiển thị các giá trị: tổng tiền trước giảm, số tiền được giảm, tổng phải thu, số đã thanh toán và số tiền còn lại.</w:t>
       </w:r>
     </w:p>
     <w:p>
       <w:pPr>
-        <w:pStyle w:val="9"/>
+        <w:pStyle w:val="10"/>
         <w:keepNext w:val="0"/>
         <w:keepLines w:val="0"/>
         <w:widowControl/>
         <w:suppressLineNumbers w:val="0"/>
         <w:ind w:left="720" w:leftChars="0" w:firstLine="720" w:firstLineChars="0"/>
-      </w:pPr>
-      <w:r>
-        <w:rPr>
-          <w:rStyle w:val="10"/>
+        <w:rPr>
+          <w:rFonts w:hint="default" w:ascii="Times New Roman" w:hAnsi="Times New Roman" w:cs="Times New Roman"/>
+        </w:rPr>
+      </w:pPr>
+      <w:r>
+        <w:rPr>
+          <w:rStyle w:val="11"/>
+          <w:rFonts w:hint="default" w:ascii="Times New Roman" w:hAnsi="Times New Roman" w:cs="Times New Roman"/>
         </w:rPr>
         <w:t>Bước 4: Kiểm tra giảm giá và khoản phát sinh</w:t>
       </w:r>
     </w:p>
     <w:p>
       <w:pPr>
-        <w:pStyle w:val="9"/>
+        <w:pStyle w:val="10"/>
         <w:keepNext w:val="0"/>
         <w:keepLines w:val="0"/>
         <w:widowControl/>
         <w:suppressLineNumbers w:val="0"/>
         <w:ind w:left="720" w:leftChars="0" w:firstLine="720" w:firstLineChars="0"/>
-      </w:pPr>
-      <w:r>
+        <w:rPr>
+          <w:rFonts w:hint="default" w:ascii="Times New Roman" w:hAnsi="Times New Roman" w:cs="Times New Roman"/>
+        </w:rPr>
+      </w:pPr>
+      <w:r>
+        <w:rPr>
+          <w:rFonts w:hint="default" w:ascii="Times New Roman" w:hAnsi="Times New Roman" w:cs="Times New Roman"/>
+        </w:rPr>
         <w:t>Lễ tân/thu ngân kiểm tra căn cứ áp dụng giảm giá, chương trình ưu đãi và các khoản phát sinh. Trường hợp giảm giá vượt hạn mức được phân quyền, hệ thống yêu cầu quản lý phê duyệt trước khi tiếp tục thanh toán.</w:t>
       </w:r>
     </w:p>
     <w:p>
       <w:pPr>
-        <w:pStyle w:val="9"/>
+        <w:pStyle w:val="10"/>
         <w:keepNext w:val="0"/>
         <w:keepLines w:val="0"/>
         <w:widowControl/>
         <w:suppressLineNumbers w:val="0"/>
         <w:ind w:left="720" w:leftChars="0" w:firstLine="720" w:firstLineChars="0"/>
-      </w:pPr>
-      <w:r>
+        <w:rPr>
+          <w:rFonts w:hint="default" w:ascii="Times New Roman" w:hAnsi="Times New Roman" w:cs="Times New Roman"/>
+        </w:rPr>
+      </w:pPr>
+      <w:r>
+        <w:rPr>
+          <w:rFonts w:hint="default" w:ascii="Times New Roman" w:hAnsi="Times New Roman" w:cs="Times New Roman"/>
+        </w:rPr>
         <w:t>Mọi khoản phát sinh phải có nội dung, số tiền, lý do, người đề nghị và người xác nhận. Hệ thống không cho phép nhập một khoản thu không xác định được nguồn gốc.</w:t>
       </w:r>
     </w:p>
     <w:p>
       <w:pPr>
-        <w:pStyle w:val="9"/>
+        <w:pStyle w:val="10"/>
         <w:keepNext w:val="0"/>
         <w:keepLines w:val="0"/>
         <w:widowControl/>
         <w:suppressLineNumbers w:val="0"/>
         <w:ind w:left="720" w:leftChars="0" w:firstLine="720" w:firstLineChars="0"/>
-      </w:pPr>
-      <w:r>
-        <w:rPr>
-          <w:rStyle w:val="10"/>
+        <w:rPr>
+          <w:rFonts w:hint="default" w:ascii="Times New Roman" w:hAnsi="Times New Roman" w:cs="Times New Roman"/>
+        </w:rPr>
+      </w:pPr>
+      <w:r>
+        <w:rPr>
+          <w:rStyle w:val="11"/>
+          <w:rFonts w:hint="default" w:ascii="Times New Roman" w:hAnsi="Times New Roman" w:cs="Times New Roman"/>
         </w:rPr>
         <w:t>Bước 5: Thông báo chi phí cho bệnh nhân</w:t>
       </w:r>
     </w:p>
     <w:p>
       <w:pPr>
-        <w:pStyle w:val="9"/>
+        <w:pStyle w:val="10"/>
         <w:keepNext w:val="0"/>
         <w:keepLines w:val="0"/>
         <w:widowControl/>
         <w:suppressLineNumbers w:val="0"/>
         <w:ind w:left="720" w:leftChars="0" w:firstLine="720" w:firstLineChars="0"/>
-      </w:pPr>
-      <w:r>
+        <w:rPr>
+          <w:rFonts w:hint="default" w:ascii="Times New Roman" w:hAnsi="Times New Roman" w:cs="Times New Roman"/>
+        </w:rPr>
+      </w:pPr>
+      <w:r>
+        <w:rPr>
+          <w:rFonts w:hint="default" w:ascii="Times New Roman" w:hAnsi="Times New Roman" w:cs="Times New Roman"/>
+        </w:rPr>
         <w:t>Trước khi thu tiền, lễ tân/thu ngân trình bày cho bệnh nhân các thông tin:</w:t>
       </w:r>
     </w:p>
@@ -1094,8 +1293,14 @@
         <w:suppressLineNumbers w:val="0"/>
         <w:spacing w:before="0" w:beforeAutospacing="1" w:after="0" w:afterAutospacing="1"/>
         <w:ind w:left="1560" w:leftChars="0" w:hanging="360"/>
-      </w:pPr>
-      <w:r>
+        <w:rPr>
+          <w:rFonts w:hint="default" w:ascii="Times New Roman" w:hAnsi="Times New Roman" w:cs="Times New Roman"/>
+        </w:rPr>
+      </w:pPr>
+      <w:r>
+        <w:rPr>
+          <w:rFonts w:hint="default" w:ascii="Times New Roman" w:hAnsi="Times New Roman" w:cs="Times New Roman"/>
+        </w:rPr>
         <w:t xml:space="preserve">Dịch vụ và số lượng đã thực hiện. </w:t>
       </w:r>
     </w:p>
@@ -1111,8 +1316,14 @@
         <w:suppressLineNumbers w:val="0"/>
         <w:spacing w:before="0" w:beforeAutospacing="1" w:after="0" w:afterAutospacing="1"/>
         <w:ind w:left="1560" w:leftChars="0" w:hanging="360"/>
-      </w:pPr>
-      <w:r>
+        <w:rPr>
+          <w:rFonts w:hint="default" w:ascii="Times New Roman" w:hAnsi="Times New Roman" w:cs="Times New Roman"/>
+        </w:rPr>
+      </w:pPr>
+      <w:r>
+        <w:rPr>
+          <w:rFonts w:hint="default" w:ascii="Times New Roman" w:hAnsi="Times New Roman" w:cs="Times New Roman"/>
+        </w:rPr>
         <w:t xml:space="preserve">Đơn giá và thành tiền của từng dịch vụ. </w:t>
       </w:r>
     </w:p>
@@ -1128,8 +1339,14 @@
         <w:suppressLineNumbers w:val="0"/>
         <w:spacing w:before="0" w:beforeAutospacing="1" w:after="0" w:afterAutospacing="1"/>
         <w:ind w:left="1560" w:leftChars="0" w:hanging="360"/>
-      </w:pPr>
-      <w:r>
+        <w:rPr>
+          <w:rFonts w:hint="default" w:ascii="Times New Roman" w:hAnsi="Times New Roman" w:cs="Times New Roman"/>
+        </w:rPr>
+      </w:pPr>
+      <w:r>
+        <w:rPr>
+          <w:rFonts w:hint="default" w:ascii="Times New Roman" w:hAnsi="Times New Roman" w:cs="Times New Roman"/>
+        </w:rPr>
         <w:t xml:space="preserve">Khoản giảm giá hoặc ưu đãi. </w:t>
       </w:r>
     </w:p>
@@ -1145,8 +1362,14 @@
         <w:suppressLineNumbers w:val="0"/>
         <w:spacing w:before="0" w:beforeAutospacing="1" w:after="0" w:afterAutospacing="1"/>
         <w:ind w:left="1560" w:leftChars="0" w:hanging="360"/>
-      </w:pPr>
-      <w:r>
+        <w:rPr>
+          <w:rFonts w:hint="default" w:ascii="Times New Roman" w:hAnsi="Times New Roman" w:cs="Times New Roman"/>
+        </w:rPr>
+      </w:pPr>
+      <w:r>
+        <w:rPr>
+          <w:rFonts w:hint="default" w:ascii="Times New Roman" w:hAnsi="Times New Roman" w:cs="Times New Roman"/>
+        </w:rPr>
         <w:t xml:space="preserve">Tiền cọc và số tiền đã thanh toán trước đó. </w:t>
       </w:r>
     </w:p>
@@ -1162,8 +1385,14 @@
         <w:suppressLineNumbers w:val="0"/>
         <w:spacing w:before="0" w:beforeAutospacing="1" w:after="0" w:afterAutospacing="1"/>
         <w:ind w:left="1560" w:leftChars="0" w:hanging="360"/>
-      </w:pPr>
-      <w:r>
+        <w:rPr>
+          <w:rFonts w:hint="default" w:ascii="Times New Roman" w:hAnsi="Times New Roman" w:cs="Times New Roman"/>
+        </w:rPr>
+      </w:pPr>
+      <w:r>
+        <w:rPr>
+          <w:rFonts w:hint="default" w:ascii="Times New Roman" w:hAnsi="Times New Roman" w:cs="Times New Roman"/>
+        </w:rPr>
         <w:t xml:space="preserve">Tổng số tiền phải thanh toán. </w:t>
       </w:r>
     </w:p>
@@ -1179,50 +1408,72 @@
         <w:suppressLineNumbers w:val="0"/>
         <w:spacing w:before="0" w:beforeAutospacing="1" w:after="0" w:afterAutospacing="1"/>
         <w:ind w:left="1560" w:leftChars="0" w:hanging="360"/>
-      </w:pPr>
-      <w:r>
+        <w:rPr>
+          <w:rFonts w:hint="default" w:ascii="Times New Roman" w:hAnsi="Times New Roman" w:cs="Times New Roman"/>
+        </w:rPr>
+      </w:pPr>
+      <w:r>
+        <w:rPr>
+          <w:rFonts w:hint="default" w:ascii="Times New Roman" w:hAnsi="Times New Roman" w:cs="Times New Roman"/>
+        </w:rPr>
         <w:t xml:space="preserve">Số tiền còn nợ sau lần thanh toán hiện tại, nếu có. </w:t>
       </w:r>
     </w:p>
     <w:p>
       <w:pPr>
-        <w:pStyle w:val="9"/>
+        <w:pStyle w:val="10"/>
         <w:keepNext w:val="0"/>
         <w:keepLines w:val="0"/>
         <w:widowControl/>
         <w:suppressLineNumbers w:val="0"/>
         <w:ind w:left="720" w:leftChars="0" w:firstLine="720" w:firstLineChars="0"/>
-      </w:pPr>
-      <w:r>
+        <w:rPr>
+          <w:rFonts w:hint="default" w:ascii="Times New Roman" w:hAnsi="Times New Roman" w:cs="Times New Roman"/>
+        </w:rPr>
+      </w:pPr>
+      <w:r>
+        <w:rPr>
+          <w:rFonts w:hint="default" w:ascii="Times New Roman" w:hAnsi="Times New Roman" w:cs="Times New Roman"/>
+        </w:rPr>
         <w:t>Bệnh nhân được kiểm tra lại thông tin trước khi lựa chọn phương thức thanh toán.</w:t>
       </w:r>
     </w:p>
     <w:p>
       <w:pPr>
-        <w:pStyle w:val="9"/>
+        <w:pStyle w:val="10"/>
         <w:keepNext w:val="0"/>
         <w:keepLines w:val="0"/>
         <w:widowControl/>
         <w:suppressLineNumbers w:val="0"/>
         <w:ind w:left="720" w:leftChars="0" w:firstLine="720" w:firstLineChars="0"/>
-      </w:pPr>
-      <w:r>
-        <w:rPr>
-          <w:rStyle w:val="10"/>
+        <w:rPr>
+          <w:rFonts w:hint="default" w:ascii="Times New Roman" w:hAnsi="Times New Roman" w:cs="Times New Roman"/>
+        </w:rPr>
+      </w:pPr>
+      <w:r>
+        <w:rPr>
+          <w:rStyle w:val="11"/>
+          <w:rFonts w:hint="default" w:ascii="Times New Roman" w:hAnsi="Times New Roman" w:cs="Times New Roman"/>
         </w:rPr>
         <w:t>Bước 6: Lựa chọn hình thức thanh toán</w:t>
       </w:r>
     </w:p>
     <w:p>
       <w:pPr>
-        <w:pStyle w:val="9"/>
+        <w:pStyle w:val="10"/>
         <w:keepNext w:val="0"/>
         <w:keepLines w:val="0"/>
         <w:widowControl/>
         <w:suppressLineNumbers w:val="0"/>
         <w:ind w:left="720" w:leftChars="0" w:firstLine="720" w:firstLineChars="0"/>
-      </w:pPr>
-      <w:r>
+        <w:rPr>
+          <w:rFonts w:hint="default" w:ascii="Times New Roman" w:hAnsi="Times New Roman" w:cs="Times New Roman"/>
+        </w:rPr>
+      </w:pPr>
+      <w:r>
+        <w:rPr>
+          <w:rFonts w:hint="default" w:ascii="Times New Roman" w:hAnsi="Times New Roman" w:cs="Times New Roman"/>
+        </w:rPr>
         <w:t>Bệnh nhân có thể lựa chọn:</w:t>
       </w:r>
     </w:p>
@@ -1238,8 +1489,14 @@
         <w:suppressLineNumbers w:val="0"/>
         <w:spacing w:before="0" w:beforeAutospacing="1" w:after="0" w:afterAutospacing="1"/>
         <w:ind w:left="1560" w:leftChars="0" w:hanging="360"/>
-      </w:pPr>
-      <w:r>
+        <w:rPr>
+          <w:rFonts w:hint="default" w:ascii="Times New Roman" w:hAnsi="Times New Roman" w:cs="Times New Roman"/>
+        </w:rPr>
+      </w:pPr>
+      <w:r>
+        <w:rPr>
+          <w:rFonts w:hint="default" w:ascii="Times New Roman" w:hAnsi="Times New Roman" w:cs="Times New Roman"/>
+        </w:rPr>
         <w:t xml:space="preserve">Thanh toán toàn bộ. </w:t>
       </w:r>
     </w:p>
@@ -1255,8 +1512,14 @@
         <w:suppressLineNumbers w:val="0"/>
         <w:spacing w:before="0" w:beforeAutospacing="1" w:after="0" w:afterAutospacing="1"/>
         <w:ind w:left="1560" w:leftChars="0" w:hanging="360"/>
-      </w:pPr>
-      <w:r>
+        <w:rPr>
+          <w:rFonts w:hint="default" w:ascii="Times New Roman" w:hAnsi="Times New Roman" w:cs="Times New Roman"/>
+        </w:rPr>
+      </w:pPr>
+      <w:r>
+        <w:rPr>
+          <w:rFonts w:hint="default" w:ascii="Times New Roman" w:hAnsi="Times New Roman" w:cs="Times New Roman"/>
+        </w:rPr>
         <w:t xml:space="preserve">Thanh toán một phần. </w:t>
       </w:r>
     </w:p>
@@ -1272,8 +1535,14 @@
         <w:suppressLineNumbers w:val="0"/>
         <w:spacing w:before="0" w:beforeAutospacing="1" w:after="0" w:afterAutospacing="1"/>
         <w:ind w:left="1560" w:leftChars="0" w:hanging="360"/>
-      </w:pPr>
-      <w:r>
+        <w:rPr>
+          <w:rFonts w:hint="default" w:ascii="Times New Roman" w:hAnsi="Times New Roman" w:cs="Times New Roman"/>
+        </w:rPr>
+      </w:pPr>
+      <w:r>
+        <w:rPr>
+          <w:rFonts w:hint="default" w:ascii="Times New Roman" w:hAnsi="Times New Roman" w:cs="Times New Roman"/>
+        </w:rPr>
         <w:t xml:space="preserve">Thanh toán theo từng giai đoạn của liệu trình. </w:t>
       </w:r>
     </w:p>
@@ -1289,8 +1558,14 @@
         <w:suppressLineNumbers w:val="0"/>
         <w:spacing w:before="0" w:beforeAutospacing="1" w:after="0" w:afterAutospacing="1"/>
         <w:ind w:left="1560" w:leftChars="0" w:hanging="360"/>
-      </w:pPr>
-      <w:r>
+        <w:rPr>
+          <w:rFonts w:hint="default" w:ascii="Times New Roman" w:hAnsi="Times New Roman" w:cs="Times New Roman"/>
+        </w:rPr>
+      </w:pPr>
+      <w:r>
+        <w:rPr>
+          <w:rFonts w:hint="default" w:ascii="Times New Roman" w:hAnsi="Times New Roman" w:cs="Times New Roman"/>
+        </w:rPr>
         <w:t xml:space="preserve">Khấu trừ từ tiền cọc. </w:t>
       </w:r>
     </w:p>
@@ -1306,105 +1581,149 @@
         <w:suppressLineNumbers w:val="0"/>
         <w:spacing w:before="0" w:beforeAutospacing="1" w:after="0" w:afterAutospacing="1"/>
         <w:ind w:left="1560" w:leftChars="0" w:hanging="360"/>
-      </w:pPr>
-      <w:r>
+        <w:rPr>
+          <w:rFonts w:hint="default" w:ascii="Times New Roman" w:hAnsi="Times New Roman" w:cs="Times New Roman"/>
+        </w:rPr>
+      </w:pPr>
+      <w:r>
+        <w:rPr>
+          <w:rFonts w:hint="default" w:ascii="Times New Roman" w:hAnsi="Times New Roman" w:cs="Times New Roman"/>
+        </w:rPr>
         <w:t xml:space="preserve">Kết hợp nhiều phương thức trong cùng một lần thanh toán. </w:t>
       </w:r>
     </w:p>
     <w:p>
       <w:pPr>
-        <w:pStyle w:val="9"/>
+        <w:pStyle w:val="10"/>
         <w:keepNext w:val="0"/>
         <w:keepLines w:val="0"/>
         <w:widowControl/>
         <w:suppressLineNumbers w:val="0"/>
         <w:ind w:left="720" w:leftChars="0" w:firstLine="720" w:firstLineChars="0"/>
-      </w:pPr>
-      <w:r>
+        <w:rPr>
+          <w:rFonts w:hint="default" w:ascii="Times New Roman" w:hAnsi="Times New Roman" w:cs="Times New Roman"/>
+        </w:rPr>
+      </w:pPr>
+      <w:r>
+        <w:rPr>
+          <w:rFonts w:hint="default" w:ascii="Times New Roman" w:hAnsi="Times New Roman" w:cs="Times New Roman"/>
+        </w:rPr>
         <w:t>Trường hợp thanh toán một phần, hệ thống phải ghi nhận số còn lại và ngày hoặc giai đoạn dự kiến thanh toán tiếp theo.</w:t>
       </w:r>
     </w:p>
     <w:p>
       <w:pPr>
-        <w:pStyle w:val="9"/>
+        <w:pStyle w:val="10"/>
         <w:keepNext w:val="0"/>
         <w:keepLines w:val="0"/>
         <w:widowControl/>
         <w:suppressLineNumbers w:val="0"/>
         <w:ind w:left="720" w:leftChars="0" w:firstLine="720" w:firstLineChars="0"/>
-      </w:pPr>
-      <w:r>
-        <w:rPr>
-          <w:rStyle w:val="10"/>
+        <w:rPr>
+          <w:rFonts w:hint="default" w:ascii="Times New Roman" w:hAnsi="Times New Roman" w:cs="Times New Roman"/>
+        </w:rPr>
+      </w:pPr>
+      <w:r>
+        <w:rPr>
+          <w:rStyle w:val="11"/>
+          <w:rFonts w:hint="default" w:ascii="Times New Roman" w:hAnsi="Times New Roman" w:cs="Times New Roman"/>
         </w:rPr>
         <w:t>Bước 7: Tiếp nhận và xác nhận tiền thanh toán</w:t>
       </w:r>
     </w:p>
     <w:p>
       <w:pPr>
-        <w:pStyle w:val="9"/>
+        <w:pStyle w:val="10"/>
         <w:keepNext w:val="0"/>
         <w:keepLines w:val="0"/>
         <w:widowControl/>
         <w:suppressLineNumbers w:val="0"/>
         <w:ind w:left="720" w:leftChars="0" w:firstLine="720" w:firstLineChars="0"/>
-      </w:pPr>
-      <w:r>
+        <w:rPr>
+          <w:rFonts w:hint="default" w:ascii="Times New Roman" w:hAnsi="Times New Roman" w:cs="Times New Roman"/>
+        </w:rPr>
+      </w:pPr>
+      <w:r>
+        <w:rPr>
+          <w:rFonts w:hint="default" w:ascii="Times New Roman" w:hAnsi="Times New Roman" w:cs="Times New Roman"/>
+        </w:rPr>
         <w:t>Lễ tân/thu ngân nhập số tiền thực nhận và phương thức thanh toán. Hệ thống kiểm tra số tiền không được âm và không được vượt quá nghĩa vụ thanh toán, trừ trường hợp được phép ghi nhận tiền trả trước.</w:t>
       </w:r>
     </w:p>
     <w:p>
       <w:pPr>
-        <w:pStyle w:val="9"/>
+        <w:pStyle w:val="10"/>
         <w:keepNext w:val="0"/>
         <w:keepLines w:val="0"/>
         <w:widowControl/>
         <w:suppressLineNumbers w:val="0"/>
         <w:ind w:left="720" w:leftChars="0" w:firstLine="720" w:firstLineChars="0"/>
-      </w:pPr>
-      <w:r>
+        <w:rPr>
+          <w:rFonts w:hint="default" w:ascii="Times New Roman" w:hAnsi="Times New Roman" w:cs="Times New Roman"/>
+        </w:rPr>
+      </w:pPr>
+      <w:r>
+        <w:rPr>
+          <w:rFonts w:hint="default" w:ascii="Times New Roman" w:hAnsi="Times New Roman" w:cs="Times New Roman"/>
+        </w:rPr>
         <w:t>Đối với giao dịch điện tử, chỉ xác nhận thanh toán khi phòng khám đã kiểm tra được trạng thái giao dịch thành công trên tài khoản ngân hàng, thiết bị POS hoặc kênh thanh toán chính thức.</w:t>
       </w:r>
     </w:p>
     <w:p>
       <w:pPr>
-        <w:pStyle w:val="9"/>
+        <w:pStyle w:val="10"/>
         <w:keepNext w:val="0"/>
         <w:keepLines w:val="0"/>
         <w:widowControl/>
         <w:suppressLineNumbers w:val="0"/>
         <w:ind w:left="720" w:leftChars="0" w:firstLine="720" w:firstLineChars="0"/>
-      </w:pPr>
-      <w:r>
+        <w:rPr>
+          <w:rFonts w:hint="default" w:ascii="Times New Roman" w:hAnsi="Times New Roman" w:cs="Times New Roman"/>
+        </w:rPr>
+      </w:pPr>
+      <w:r>
+        <w:rPr>
+          <w:rFonts w:hint="default" w:ascii="Times New Roman" w:hAnsi="Times New Roman" w:cs="Times New Roman"/>
+        </w:rPr>
         <w:t>Nếu bệnh nhân sử dụng nhiều phương thức, hệ thống phải tách riêng số tiền của từng phương thức, ví dụ: 2.000.000 đồng tiền mặt và 3.000.000 đồng chuyển khoản.</w:t>
       </w:r>
     </w:p>
     <w:p>
       <w:pPr>
-        <w:pStyle w:val="9"/>
+        <w:pStyle w:val="10"/>
         <w:keepNext w:val="0"/>
         <w:keepLines w:val="0"/>
         <w:widowControl/>
         <w:suppressLineNumbers w:val="0"/>
         <w:ind w:left="720" w:leftChars="0" w:firstLine="720" w:firstLineChars="0"/>
-      </w:pPr>
-      <w:r>
-        <w:rPr>
-          <w:rStyle w:val="10"/>
+        <w:rPr>
+          <w:rFonts w:hint="default" w:ascii="Times New Roman" w:hAnsi="Times New Roman" w:cs="Times New Roman"/>
+        </w:rPr>
+      </w:pPr>
+      <w:r>
+        <w:rPr>
+          <w:rStyle w:val="11"/>
+          <w:rFonts w:hint="default" w:ascii="Times New Roman" w:hAnsi="Times New Roman" w:cs="Times New Roman"/>
         </w:rPr>
         <w:t>Bước 8: Ghi nhận giao dịch</w:t>
       </w:r>
     </w:p>
     <w:p>
       <w:pPr>
-        <w:pStyle w:val="9"/>
+        <w:pStyle w:val="10"/>
         <w:keepNext w:val="0"/>
         <w:keepLines w:val="0"/>
         <w:widowControl/>
         <w:suppressLineNumbers w:val="0"/>
         <w:ind w:left="720" w:leftChars="0" w:firstLine="720" w:firstLineChars="0"/>
-      </w:pPr>
-      <w:r>
+        <w:rPr>
+          <w:rFonts w:hint="default" w:ascii="Times New Roman" w:hAnsi="Times New Roman" w:cs="Times New Roman"/>
+        </w:rPr>
+      </w:pPr>
+      <w:r>
+        <w:rPr>
+          <w:rFonts w:hint="default" w:ascii="Times New Roman" w:hAnsi="Times New Roman" w:cs="Times New Roman"/>
+        </w:rPr>
         <w:t>Sau khi thu tiền thành công, hệ thống tạo một giao dịch thanh toán mới gồm:</w:t>
       </w:r>
     </w:p>
@@ -1420,8 +1739,14 @@
         <w:suppressLineNumbers w:val="0"/>
         <w:spacing w:before="0" w:beforeAutospacing="1" w:after="0" w:afterAutospacing="1"/>
         <w:ind w:left="1560" w:leftChars="0" w:hanging="360"/>
-      </w:pPr>
-      <w:r>
+        <w:rPr>
+          <w:rFonts w:hint="default" w:ascii="Times New Roman" w:hAnsi="Times New Roman" w:cs="Times New Roman"/>
+        </w:rPr>
+      </w:pPr>
+      <w:r>
+        <w:rPr>
+          <w:rFonts w:hint="default" w:ascii="Times New Roman" w:hAnsi="Times New Roman" w:cs="Times New Roman"/>
+        </w:rPr>
         <w:t xml:space="preserve">Mã giao dịch. </w:t>
       </w:r>
     </w:p>
@@ -1437,8 +1762,14 @@
         <w:suppressLineNumbers w:val="0"/>
         <w:spacing w:before="0" w:beforeAutospacing="1" w:after="0" w:afterAutospacing="1"/>
         <w:ind w:left="1560" w:leftChars="0" w:hanging="360"/>
-      </w:pPr>
-      <w:r>
+        <w:rPr>
+          <w:rFonts w:hint="default" w:ascii="Times New Roman" w:hAnsi="Times New Roman" w:cs="Times New Roman"/>
+        </w:rPr>
+      </w:pPr>
+      <w:r>
+        <w:rPr>
+          <w:rFonts w:hint="default" w:ascii="Times New Roman" w:hAnsi="Times New Roman" w:cs="Times New Roman"/>
+        </w:rPr>
         <w:t xml:space="preserve">Mã bệnh nhân. </w:t>
       </w:r>
     </w:p>
@@ -1454,8 +1785,14 @@
         <w:suppressLineNumbers w:val="0"/>
         <w:spacing w:before="0" w:beforeAutospacing="1" w:after="0" w:afterAutospacing="1"/>
         <w:ind w:left="1560" w:leftChars="0" w:hanging="360"/>
-      </w:pPr>
-      <w:r>
+        <w:rPr>
+          <w:rFonts w:hint="default" w:ascii="Times New Roman" w:hAnsi="Times New Roman" w:cs="Times New Roman"/>
+        </w:rPr>
+      </w:pPr>
+      <w:r>
+        <w:rPr>
+          <w:rFonts w:hint="default" w:ascii="Times New Roman" w:hAnsi="Times New Roman" w:cs="Times New Roman"/>
+        </w:rPr>
         <w:t xml:space="preserve">Lần khám hoặc liệu trình liên quan. </w:t>
       </w:r>
     </w:p>
@@ -1471,8 +1808,14 @@
         <w:suppressLineNumbers w:val="0"/>
         <w:spacing w:before="0" w:beforeAutospacing="1" w:after="0" w:afterAutospacing="1"/>
         <w:ind w:left="1560" w:leftChars="0" w:hanging="360"/>
-      </w:pPr>
-      <w:r>
+        <w:rPr>
+          <w:rFonts w:hint="default" w:ascii="Times New Roman" w:hAnsi="Times New Roman" w:cs="Times New Roman"/>
+        </w:rPr>
+      </w:pPr>
+      <w:r>
+        <w:rPr>
+          <w:rFonts w:hint="default" w:ascii="Times New Roman" w:hAnsi="Times New Roman" w:cs="Times New Roman"/>
+        </w:rPr>
         <w:t xml:space="preserve">Số tiền thanh toán. </w:t>
       </w:r>
     </w:p>
@@ -1488,8 +1831,14 @@
         <w:suppressLineNumbers w:val="0"/>
         <w:spacing w:before="0" w:beforeAutospacing="1" w:after="0" w:afterAutospacing="1"/>
         <w:ind w:left="1560" w:leftChars="0" w:hanging="360"/>
-      </w:pPr>
-      <w:r>
+        <w:rPr>
+          <w:rFonts w:hint="default" w:ascii="Times New Roman" w:hAnsi="Times New Roman" w:cs="Times New Roman"/>
+        </w:rPr>
+      </w:pPr>
+      <w:r>
+        <w:rPr>
+          <w:rFonts w:hint="default" w:ascii="Times New Roman" w:hAnsi="Times New Roman" w:cs="Times New Roman"/>
+        </w:rPr>
         <w:t xml:space="preserve">Phương thức thanh toán. </w:t>
       </w:r>
     </w:p>
@@ -1505,8 +1854,14 @@
         <w:suppressLineNumbers w:val="0"/>
         <w:spacing w:before="0" w:beforeAutospacing="1" w:after="0" w:afterAutospacing="1"/>
         <w:ind w:left="1560" w:leftChars="0" w:hanging="360"/>
-      </w:pPr>
-      <w:r>
+        <w:rPr>
+          <w:rFonts w:hint="default" w:ascii="Times New Roman" w:hAnsi="Times New Roman" w:cs="Times New Roman"/>
+        </w:rPr>
+      </w:pPr>
+      <w:r>
+        <w:rPr>
+          <w:rFonts w:hint="default" w:ascii="Times New Roman" w:hAnsi="Times New Roman" w:cs="Times New Roman"/>
+        </w:rPr>
         <w:t xml:space="preserve">Mã tham chiếu của giao dịch điện tử. </w:t>
       </w:r>
     </w:p>
@@ -1522,8 +1877,14 @@
         <w:suppressLineNumbers w:val="0"/>
         <w:spacing w:before="0" w:beforeAutospacing="1" w:after="0" w:afterAutospacing="1"/>
         <w:ind w:left="1560" w:leftChars="0" w:hanging="360"/>
-      </w:pPr>
-      <w:r>
+        <w:rPr>
+          <w:rFonts w:hint="default" w:ascii="Times New Roman" w:hAnsi="Times New Roman" w:cs="Times New Roman"/>
+        </w:rPr>
+      </w:pPr>
+      <w:r>
+        <w:rPr>
+          <w:rFonts w:hint="default" w:ascii="Times New Roman" w:hAnsi="Times New Roman" w:cs="Times New Roman"/>
+        </w:rPr>
         <w:t xml:space="preserve">Thời điểm thanh toán. </w:t>
       </w:r>
     </w:p>
@@ -1539,8 +1900,14 @@
         <w:suppressLineNumbers w:val="0"/>
         <w:spacing w:before="0" w:beforeAutospacing="1" w:after="0" w:afterAutospacing="1"/>
         <w:ind w:left="1560" w:leftChars="0" w:hanging="360"/>
-      </w:pPr>
-      <w:r>
+        <w:rPr>
+          <w:rFonts w:hint="default" w:ascii="Times New Roman" w:hAnsi="Times New Roman" w:cs="Times New Roman"/>
+        </w:rPr>
+      </w:pPr>
+      <w:r>
+        <w:rPr>
+          <w:rFonts w:hint="default" w:ascii="Times New Roman" w:hAnsi="Times New Roman" w:cs="Times New Roman"/>
+        </w:rPr>
         <w:t xml:space="preserve">Nhân viên thu tiền. </w:t>
       </w:r>
     </w:p>
@@ -1556,8 +1923,14 @@
         <w:suppressLineNumbers w:val="0"/>
         <w:spacing w:before="0" w:beforeAutospacing="1" w:after="0" w:afterAutospacing="1"/>
         <w:ind w:left="1560" w:leftChars="0" w:hanging="360"/>
-      </w:pPr>
-      <w:r>
+        <w:rPr>
+          <w:rFonts w:hint="default" w:ascii="Times New Roman" w:hAnsi="Times New Roman" w:cs="Times New Roman"/>
+        </w:rPr>
+      </w:pPr>
+      <w:r>
+        <w:rPr>
+          <w:rFonts w:hint="default" w:ascii="Times New Roman" w:hAnsi="Times New Roman" w:cs="Times New Roman"/>
+        </w:rPr>
         <w:t xml:space="preserve">Số tiền đã trả và số còn lại sau giao dịch. </w:t>
       </w:r>
     </w:p>
@@ -1573,50 +1946,72 @@
         <w:suppressLineNumbers w:val="0"/>
         <w:spacing w:before="0" w:beforeAutospacing="1" w:after="0" w:afterAutospacing="1"/>
         <w:ind w:left="1560" w:leftChars="0" w:hanging="360"/>
-      </w:pPr>
-      <w:r>
+        <w:rPr>
+          <w:rFonts w:hint="default" w:ascii="Times New Roman" w:hAnsi="Times New Roman" w:cs="Times New Roman"/>
+        </w:rPr>
+      </w:pPr>
+      <w:r>
+        <w:rPr>
+          <w:rFonts w:hint="default" w:ascii="Times New Roman" w:hAnsi="Times New Roman" w:cs="Times New Roman"/>
+        </w:rPr>
         <w:t xml:space="preserve">Trạng thái giao dịch. </w:t>
       </w:r>
     </w:p>
     <w:p>
       <w:pPr>
-        <w:pStyle w:val="9"/>
+        <w:pStyle w:val="10"/>
         <w:keepNext w:val="0"/>
         <w:keepLines w:val="0"/>
         <w:widowControl/>
         <w:suppressLineNumbers w:val="0"/>
         <w:ind w:left="720" w:leftChars="0" w:firstLine="720" w:firstLineChars="0"/>
-      </w:pPr>
-      <w:r>
+        <w:rPr>
+          <w:rFonts w:hint="default" w:ascii="Times New Roman" w:hAnsi="Times New Roman" w:cs="Times New Roman"/>
+        </w:rPr>
+      </w:pPr>
+      <w:r>
+        <w:rPr>
+          <w:rFonts w:hint="default" w:ascii="Times New Roman" w:hAnsi="Times New Roman" w:cs="Times New Roman"/>
+        </w:rPr>
         <w:t>Mỗi lần thanh toán phải được lưu thành một giao dịch độc lập. Không sửa đè giao dịch đã chốt.</w:t>
       </w:r>
     </w:p>
     <w:p>
       <w:pPr>
-        <w:pStyle w:val="9"/>
+        <w:pStyle w:val="10"/>
         <w:keepNext w:val="0"/>
         <w:keepLines w:val="0"/>
         <w:widowControl/>
         <w:suppressLineNumbers w:val="0"/>
         <w:ind w:left="720" w:leftChars="0" w:firstLine="720" w:firstLineChars="0"/>
-      </w:pPr>
-      <w:r>
-        <w:rPr>
-          <w:rStyle w:val="10"/>
+        <w:rPr>
+          <w:rFonts w:hint="default" w:ascii="Times New Roman" w:hAnsi="Times New Roman" w:cs="Times New Roman"/>
+        </w:rPr>
+      </w:pPr>
+      <w:r>
+        <w:rPr>
+          <w:rStyle w:val="11"/>
+          <w:rFonts w:hint="default" w:ascii="Times New Roman" w:hAnsi="Times New Roman" w:cs="Times New Roman"/>
         </w:rPr>
         <w:t>Bước 9: Cập nhật trạng thái thanh toán</w:t>
       </w:r>
     </w:p>
     <w:p>
       <w:pPr>
-        <w:pStyle w:val="9"/>
+        <w:pStyle w:val="10"/>
         <w:keepNext w:val="0"/>
         <w:keepLines w:val="0"/>
         <w:widowControl/>
         <w:suppressLineNumbers w:val="0"/>
         <w:ind w:left="720" w:leftChars="0" w:firstLine="720" w:firstLineChars="0"/>
-      </w:pPr>
-      <w:r>
+        <w:rPr>
+          <w:rFonts w:hint="default" w:ascii="Times New Roman" w:hAnsi="Times New Roman" w:cs="Times New Roman"/>
+        </w:rPr>
+      </w:pPr>
+      <w:r>
+        <w:rPr>
+          <w:rFonts w:hint="default" w:ascii="Times New Roman" w:hAnsi="Times New Roman" w:cs="Times New Roman"/>
+        </w:rPr>
         <w:t>Căn cứ vào tổng phải thu và số tiền hợp lệ đã nhận, hệ thống tự động cập nhật trạng thái:</w:t>
       </w:r>
     </w:p>
@@ -1632,14 +2027,21 @@
         <w:suppressLineNumbers w:val="0"/>
         <w:spacing w:before="0" w:beforeAutospacing="1" w:after="0" w:afterAutospacing="1"/>
         <w:ind w:left="1560" w:leftChars="0" w:hanging="360"/>
-      </w:pPr>
-      <w:r>
-        <w:rPr>
-          <w:rStyle w:val="10"/>
+        <w:rPr>
+          <w:rFonts w:hint="default" w:ascii="Times New Roman" w:hAnsi="Times New Roman" w:cs="Times New Roman"/>
+        </w:rPr>
+      </w:pPr>
+      <w:r>
+        <w:rPr>
+          <w:rStyle w:val="11"/>
+          <w:rFonts w:hint="default" w:ascii="Times New Roman" w:hAnsi="Times New Roman" w:cs="Times New Roman"/>
         </w:rPr>
         <w:t>Chưa thanh toán:</w:t>
       </w:r>
       <w:r>
+        <w:rPr>
+          <w:rFonts w:hint="default" w:ascii="Times New Roman" w:hAnsi="Times New Roman" w:cs="Times New Roman"/>
+        </w:rPr>
         <w:t xml:space="preserve"> chưa phát sinh khoản thu. </w:t>
       </w:r>
     </w:p>
@@ -1655,14 +2057,21 @@
         <w:suppressLineNumbers w:val="0"/>
         <w:spacing w:before="0" w:beforeAutospacing="1" w:after="0" w:afterAutospacing="1"/>
         <w:ind w:left="1560" w:leftChars="0" w:hanging="360"/>
-      </w:pPr>
-      <w:r>
-        <w:rPr>
-          <w:rStyle w:val="10"/>
+        <w:rPr>
+          <w:rFonts w:hint="default" w:ascii="Times New Roman" w:hAnsi="Times New Roman" w:cs="Times New Roman"/>
+        </w:rPr>
+      </w:pPr>
+      <w:r>
+        <w:rPr>
+          <w:rStyle w:val="11"/>
+          <w:rFonts w:hint="default" w:ascii="Times New Roman" w:hAnsi="Times New Roman" w:cs="Times New Roman"/>
         </w:rPr>
         <w:t>Đã đặt cọc:</w:t>
       </w:r>
       <w:r>
+        <w:rPr>
+          <w:rFonts w:hint="default" w:ascii="Times New Roman" w:hAnsi="Times New Roman" w:cs="Times New Roman"/>
+        </w:rPr>
         <w:t xml:space="preserve"> đã thu tiền cọc nhưng chưa hoàn thành nghĩa vụ thanh toán. </w:t>
       </w:r>
     </w:p>
@@ -1678,14 +2087,21 @@
         <w:suppressLineNumbers w:val="0"/>
         <w:spacing w:before="0" w:beforeAutospacing="1" w:after="0" w:afterAutospacing="1"/>
         <w:ind w:left="1560" w:leftChars="0" w:hanging="360"/>
-      </w:pPr>
-      <w:r>
-        <w:rPr>
-          <w:rStyle w:val="10"/>
+        <w:rPr>
+          <w:rFonts w:hint="default" w:ascii="Times New Roman" w:hAnsi="Times New Roman" w:cs="Times New Roman"/>
+        </w:rPr>
+      </w:pPr>
+      <w:r>
+        <w:rPr>
+          <w:rStyle w:val="11"/>
+          <w:rFonts w:hint="default" w:ascii="Times New Roman" w:hAnsi="Times New Roman" w:cs="Times New Roman"/>
         </w:rPr>
         <w:t>Thanh toán một phần:</w:t>
       </w:r>
       <w:r>
+        <w:rPr>
+          <w:rFonts w:hint="default" w:ascii="Times New Roman" w:hAnsi="Times New Roman" w:cs="Times New Roman"/>
+        </w:rPr>
         <w:t xml:space="preserve"> đã thu một phần và vẫn còn số tiền phải thu. </w:t>
       </w:r>
     </w:p>
@@ -1701,14 +2117,21 @@
         <w:suppressLineNumbers w:val="0"/>
         <w:spacing w:before="0" w:beforeAutospacing="1" w:after="0" w:afterAutospacing="1"/>
         <w:ind w:left="1560" w:leftChars="0" w:hanging="360"/>
-      </w:pPr>
-      <w:r>
-        <w:rPr>
-          <w:rStyle w:val="10"/>
+        <w:rPr>
+          <w:rFonts w:hint="default" w:ascii="Times New Roman" w:hAnsi="Times New Roman" w:cs="Times New Roman"/>
+        </w:rPr>
+      </w:pPr>
+      <w:r>
+        <w:rPr>
+          <w:rStyle w:val="11"/>
+          <w:rFonts w:hint="default" w:ascii="Times New Roman" w:hAnsi="Times New Roman" w:cs="Times New Roman"/>
         </w:rPr>
         <w:t>Đã thanh toán đủ:</w:t>
       </w:r>
       <w:r>
+        <w:rPr>
+          <w:rFonts w:hint="default" w:ascii="Times New Roman" w:hAnsi="Times New Roman" w:cs="Times New Roman"/>
+        </w:rPr>
         <w:t xml:space="preserve"> tổng số tiền hợp lệ đã thu bằng tổng phải thu. </w:t>
       </w:r>
     </w:p>
@@ -1724,14 +2147,21 @@
         <w:suppressLineNumbers w:val="0"/>
         <w:spacing w:before="0" w:beforeAutospacing="1" w:after="0" w:afterAutospacing="1"/>
         <w:ind w:left="1560" w:leftChars="0" w:hanging="360"/>
-      </w:pPr>
-      <w:r>
-        <w:rPr>
-          <w:rStyle w:val="10"/>
+        <w:rPr>
+          <w:rFonts w:hint="default" w:ascii="Times New Roman" w:hAnsi="Times New Roman" w:cs="Times New Roman"/>
+        </w:rPr>
+      </w:pPr>
+      <w:r>
+        <w:rPr>
+          <w:rStyle w:val="11"/>
+          <w:rFonts w:hint="default" w:ascii="Times New Roman" w:hAnsi="Times New Roman" w:cs="Times New Roman"/>
         </w:rPr>
         <w:t>Quá hạn:</w:t>
       </w:r>
       <w:r>
+        <w:rPr>
+          <w:rFonts w:hint="default" w:ascii="Times New Roman" w:hAnsi="Times New Roman" w:cs="Times New Roman"/>
+        </w:rPr>
         <w:t xml:space="preserve"> khoản còn lại đã vượt ngày thanh toán dự kiến. </w:t>
       </w:r>
     </w:p>
@@ -1747,14 +2177,21 @@
         <w:suppressLineNumbers w:val="0"/>
         <w:spacing w:before="0" w:beforeAutospacing="1" w:after="0" w:afterAutospacing="1"/>
         <w:ind w:left="1560" w:leftChars="0" w:hanging="360"/>
-      </w:pPr>
-      <w:r>
-        <w:rPr>
-          <w:rStyle w:val="10"/>
+        <w:rPr>
+          <w:rFonts w:hint="default" w:ascii="Times New Roman" w:hAnsi="Times New Roman" w:cs="Times New Roman"/>
+        </w:rPr>
+      </w:pPr>
+      <w:r>
+        <w:rPr>
+          <w:rStyle w:val="11"/>
+          <w:rFonts w:hint="default" w:ascii="Times New Roman" w:hAnsi="Times New Roman" w:cs="Times New Roman"/>
         </w:rPr>
         <w:t>Đã hủy:</w:t>
       </w:r>
       <w:r>
+        <w:rPr>
+          <w:rFonts w:hint="default" w:ascii="Times New Roman" w:hAnsi="Times New Roman" w:cs="Times New Roman"/>
+        </w:rPr>
         <w:t xml:space="preserve"> giao dịch được hủy theo đúng quy trình. </w:t>
       </w:r>
     </w:p>
@@ -1770,85 +2207,118 @@
         <w:suppressLineNumbers w:val="0"/>
         <w:spacing w:before="0" w:beforeAutospacing="1" w:after="0" w:afterAutospacing="1"/>
         <w:ind w:left="1560" w:leftChars="0" w:hanging="360"/>
-      </w:pPr>
-      <w:r>
-        <w:rPr>
-          <w:rStyle w:val="10"/>
+        <w:rPr>
+          <w:rFonts w:hint="default" w:ascii="Times New Roman" w:hAnsi="Times New Roman" w:cs="Times New Roman"/>
+        </w:rPr>
+      </w:pPr>
+      <w:r>
+        <w:rPr>
+          <w:rStyle w:val="11"/>
+          <w:rFonts w:hint="default" w:ascii="Times New Roman" w:hAnsi="Times New Roman" w:cs="Times New Roman"/>
         </w:rPr>
         <w:t>Đã hoàn tiền:</w:t>
       </w:r>
       <w:r>
+        <w:rPr>
+          <w:rFonts w:hint="default" w:ascii="Times New Roman" w:hAnsi="Times New Roman" w:cs="Times New Roman"/>
+        </w:rPr>
         <w:t xml:space="preserve"> toàn bộ hoặc một phần tiền đã được hoàn trả. </w:t>
       </w:r>
     </w:p>
     <w:p>
       <w:pPr>
-        <w:pStyle w:val="9"/>
+        <w:pStyle w:val="10"/>
         <w:keepNext w:val="0"/>
         <w:keepLines w:val="0"/>
         <w:widowControl/>
         <w:suppressLineNumbers w:val="0"/>
         <w:ind w:left="720" w:leftChars="0" w:firstLine="720" w:firstLineChars="0"/>
-      </w:pPr>
-      <w:r>
-        <w:rPr>
-          <w:rStyle w:val="10"/>
+        <w:rPr>
+          <w:rFonts w:hint="default" w:ascii="Times New Roman" w:hAnsi="Times New Roman" w:cs="Times New Roman"/>
+        </w:rPr>
+      </w:pPr>
+      <w:r>
+        <w:rPr>
+          <w:rStyle w:val="11"/>
+          <w:rFonts w:hint="default" w:ascii="Times New Roman" w:hAnsi="Times New Roman" w:cs="Times New Roman"/>
         </w:rPr>
         <w:t>Bước 10: Lập và giao chứng từ</w:t>
       </w:r>
     </w:p>
     <w:p>
       <w:pPr>
-        <w:pStyle w:val="9"/>
+        <w:pStyle w:val="10"/>
         <w:keepNext w:val="0"/>
         <w:keepLines w:val="0"/>
         <w:widowControl/>
         <w:suppressLineNumbers w:val="0"/>
         <w:ind w:left="720" w:leftChars="0" w:firstLine="720" w:firstLineChars="0"/>
-      </w:pPr>
-      <w:r>
+        <w:rPr>
+          <w:rFonts w:hint="default" w:ascii="Times New Roman" w:hAnsi="Times New Roman" w:cs="Times New Roman"/>
+        </w:rPr>
+      </w:pPr>
+      <w:r>
+        <w:rPr>
+          <w:rFonts w:hint="default" w:ascii="Times New Roman" w:hAnsi="Times New Roman" w:cs="Times New Roman"/>
+        </w:rPr>
         <w:t>Hệ thống tạo phiếu thu cho từng lần thanh toán. Phiếu thu phải thể hiện tối thiểu mã phiếu, bệnh nhân, nội dung thu, số tiền, phương thức, thời điểm và nhân viên thu tiền.</w:t>
       </w:r>
     </w:p>
     <w:p>
       <w:pPr>
-        <w:pStyle w:val="9"/>
+        <w:pStyle w:val="10"/>
         <w:keepNext w:val="0"/>
         <w:keepLines w:val="0"/>
         <w:widowControl/>
         <w:suppressLineNumbers w:val="0"/>
         <w:ind w:left="720" w:leftChars="0" w:firstLine="720" w:firstLineChars="0"/>
-      </w:pPr>
-      <w:r>
+        <w:rPr>
+          <w:rFonts w:hint="default" w:ascii="Times New Roman" w:hAnsi="Times New Roman" w:cs="Times New Roman"/>
+        </w:rPr>
+      </w:pPr>
+      <w:r>
+        <w:rPr>
+          <w:rFonts w:hint="default" w:ascii="Times New Roman" w:hAnsi="Times New Roman" w:cs="Times New Roman"/>
+        </w:rPr>
         <w:t>Lễ tân/thu ngân có thể in phiếu thu hoặc gửi bản điện tử cho bệnh nhân. Nếu bệnh nhân yêu cầu hóa đơn điện tử, yêu cầu được chuyển đến tài khoản có thẩm quyền xử lý.</w:t>
       </w:r>
     </w:p>
     <w:p>
       <w:pPr>
-        <w:pStyle w:val="9"/>
+        <w:pStyle w:val="10"/>
         <w:keepNext w:val="0"/>
         <w:keepLines w:val="0"/>
         <w:widowControl/>
         <w:suppressLineNumbers w:val="0"/>
         <w:ind w:left="720" w:leftChars="0" w:firstLine="720" w:firstLineChars="0"/>
-      </w:pPr>
-      <w:r>
-        <w:rPr>
-          <w:rStyle w:val="10"/>
+        <w:rPr>
+          <w:rFonts w:hint="default" w:ascii="Times New Roman" w:hAnsi="Times New Roman" w:cs="Times New Roman"/>
+        </w:rPr>
+      </w:pPr>
+      <w:r>
+        <w:rPr>
+          <w:rStyle w:val="11"/>
+          <w:rFonts w:hint="default" w:ascii="Times New Roman" w:hAnsi="Times New Roman" w:cs="Times New Roman"/>
         </w:rPr>
         <w:t>Bước 11: Hoàn tất và chuyển sang công việc tiếp theo</w:t>
       </w:r>
     </w:p>
     <w:p>
       <w:pPr>
-        <w:pStyle w:val="9"/>
+        <w:pStyle w:val="10"/>
         <w:keepNext w:val="0"/>
         <w:keepLines w:val="0"/>
         <w:widowControl/>
         <w:suppressLineNumbers w:val="0"/>
         <w:ind w:left="720" w:leftChars="0" w:firstLine="720" w:firstLineChars="0"/>
-      </w:pPr>
-      <w:r>
+        <w:rPr>
+          <w:rFonts w:hint="default" w:ascii="Times New Roman" w:hAnsi="Times New Roman" w:cs="Times New Roman"/>
+        </w:rPr>
+      </w:pPr>
+      <w:r>
+        <w:rPr>
+          <w:rFonts w:hint="default" w:ascii="Times New Roman" w:hAnsi="Times New Roman" w:cs="Times New Roman"/>
+        </w:rPr>
         <w:t>Sau khi hoàn tất giao dịch, lễ tân/thu ngân:</w:t>
       </w:r>
     </w:p>
@@ -1864,8 +2334,14 @@
         <w:suppressLineNumbers w:val="0"/>
         <w:spacing w:before="0" w:beforeAutospacing="1" w:after="0" w:afterAutospacing="1"/>
         <w:ind w:left="1560" w:leftChars="0" w:hanging="360"/>
-      </w:pPr>
-      <w:r>
+        <w:rPr>
+          <w:rFonts w:hint="default" w:ascii="Times New Roman" w:hAnsi="Times New Roman" w:cs="Times New Roman"/>
+        </w:rPr>
+      </w:pPr>
+      <w:r>
+        <w:rPr>
+          <w:rFonts w:hint="default" w:ascii="Times New Roman" w:hAnsi="Times New Roman" w:cs="Times New Roman"/>
+        </w:rPr>
         <w:t xml:space="preserve">Kiểm tra lại trạng thái thanh toán. </w:t>
       </w:r>
     </w:p>
@@ -1881,8 +2357,14 @@
         <w:suppressLineNumbers w:val="0"/>
         <w:spacing w:before="0" w:beforeAutospacing="1" w:after="0" w:afterAutospacing="1"/>
         <w:ind w:left="1560" w:leftChars="0" w:hanging="360"/>
-      </w:pPr>
-      <w:r>
+        <w:rPr>
+          <w:rFonts w:hint="default" w:ascii="Times New Roman" w:hAnsi="Times New Roman" w:cs="Times New Roman"/>
+        </w:rPr>
+      </w:pPr>
+      <w:r>
+        <w:rPr>
+          <w:rFonts w:hint="default" w:ascii="Times New Roman" w:hAnsi="Times New Roman" w:cs="Times New Roman"/>
+        </w:rPr>
         <w:t xml:space="preserve">Thông báo số tiền còn lại và thời hạn thanh toán tiếp theo. </w:t>
       </w:r>
     </w:p>
@@ -1898,8 +2380,14 @@
         <w:suppressLineNumbers w:val="0"/>
         <w:spacing w:before="0" w:beforeAutospacing="1" w:after="0" w:afterAutospacing="1"/>
         <w:ind w:left="1560" w:leftChars="0" w:hanging="360"/>
-      </w:pPr>
-      <w:r>
+        <w:rPr>
+          <w:rFonts w:hint="default" w:ascii="Times New Roman" w:hAnsi="Times New Roman" w:cs="Times New Roman"/>
+        </w:rPr>
+      </w:pPr>
+      <w:r>
+        <w:rPr>
+          <w:rFonts w:hint="default" w:ascii="Times New Roman" w:hAnsi="Times New Roman" w:cs="Times New Roman"/>
+        </w:rPr>
         <w:t xml:space="preserve">Giao hoặc gửi phiếu thu cho bệnh nhân. </w:t>
       </w:r>
     </w:p>
@@ -1915,8 +2403,14 @@
         <w:suppressLineNumbers w:val="0"/>
         <w:spacing w:before="0" w:beforeAutospacing="1" w:after="0" w:afterAutospacing="1"/>
         <w:ind w:left="1560" w:leftChars="0" w:hanging="360"/>
-      </w:pPr>
-      <w:r>
+        <w:rPr>
+          <w:rFonts w:hint="default" w:ascii="Times New Roman" w:hAnsi="Times New Roman" w:cs="Times New Roman"/>
+        </w:rPr>
+      </w:pPr>
+      <w:r>
+        <w:rPr>
+          <w:rFonts w:hint="default" w:ascii="Times New Roman" w:hAnsi="Times New Roman" w:cs="Times New Roman"/>
+        </w:rPr>
         <w:t xml:space="preserve">Đặt lịch điều trị hoặc tái khám tiếp theo nếu cần. </w:t>
       </w:r>
     </w:p>
@@ -1932,37 +2426,53 @@
         <w:suppressLineNumbers w:val="0"/>
         <w:spacing w:before="0" w:beforeAutospacing="1" w:after="0" w:afterAutospacing="1"/>
         <w:ind w:left="1560" w:leftChars="0" w:hanging="360"/>
-      </w:pPr>
-      <w:r>
+        <w:rPr>
+          <w:rFonts w:hint="default" w:ascii="Times New Roman" w:hAnsi="Times New Roman" w:cs="Times New Roman"/>
+        </w:rPr>
+      </w:pPr>
+      <w:r>
+        <w:rPr>
+          <w:rFonts w:hint="default" w:ascii="Times New Roman" w:hAnsi="Times New Roman" w:cs="Times New Roman"/>
+        </w:rPr>
         <w:t xml:space="preserve">Lưu đầy đủ thông tin giao dịch để phục vụ tra cứu và đối soát. </w:t>
       </w:r>
     </w:p>
     <w:p>
       <w:pPr>
-        <w:pStyle w:val="9"/>
+        <w:pStyle w:val="10"/>
         <w:keepNext w:val="0"/>
         <w:keepLines w:val="0"/>
         <w:widowControl/>
         <w:suppressLineNumbers w:val="0"/>
         <w:ind w:left="720" w:leftChars="0" w:firstLine="720" w:firstLineChars="0"/>
-      </w:pPr>
-      <w:r>
-        <w:rPr>
-          <w:rStyle w:val="10"/>
+        <w:rPr>
+          <w:rFonts w:hint="default" w:ascii="Times New Roman" w:hAnsi="Times New Roman" w:cs="Times New Roman"/>
+        </w:rPr>
+      </w:pPr>
+      <w:r>
+        <w:rPr>
+          <w:rStyle w:val="11"/>
+          <w:rFonts w:hint="default" w:ascii="Times New Roman" w:hAnsi="Times New Roman" w:cs="Times New Roman"/>
         </w:rPr>
         <w:t>Bước 12: Đối soát cuối ca hoặc cuối ngày</w:t>
       </w:r>
     </w:p>
     <w:p>
       <w:pPr>
-        <w:pStyle w:val="9"/>
+        <w:pStyle w:val="10"/>
         <w:keepNext w:val="0"/>
         <w:keepLines w:val="0"/>
         <w:widowControl/>
         <w:suppressLineNumbers w:val="0"/>
         <w:ind w:left="720" w:leftChars="0" w:firstLine="720" w:firstLineChars="0"/>
-      </w:pPr>
-      <w:r>
+        <w:rPr>
+          <w:rFonts w:hint="default" w:ascii="Times New Roman" w:hAnsi="Times New Roman" w:cs="Times New Roman"/>
+        </w:rPr>
+      </w:pPr>
+      <w:r>
+        <w:rPr>
+          <w:rFonts w:hint="default" w:ascii="Times New Roman" w:hAnsi="Times New Roman" w:cs="Times New Roman"/>
+        </w:rPr>
         <w:t>Cuối ca, thu ngân tổng hợp giao dịch theo từng phương thức thanh toán và đối chiếu với:</w:t>
       </w:r>
     </w:p>
@@ -1978,8 +2488,14 @@
         <w:suppressLineNumbers w:val="0"/>
         <w:spacing w:before="0" w:beforeAutospacing="1" w:after="0" w:afterAutospacing="1"/>
         <w:ind w:left="1560" w:leftChars="0" w:hanging="360"/>
-      </w:pPr>
-      <w:r>
+        <w:rPr>
+          <w:rFonts w:hint="default" w:ascii="Times New Roman" w:hAnsi="Times New Roman" w:cs="Times New Roman"/>
+        </w:rPr>
+      </w:pPr>
+      <w:r>
+        <w:rPr>
+          <w:rFonts w:hint="default" w:ascii="Times New Roman" w:hAnsi="Times New Roman" w:cs="Times New Roman"/>
+        </w:rPr>
         <w:t xml:space="preserve">Tiền mặt thực tế trong quỹ. </w:t>
       </w:r>
     </w:p>
@@ -1995,8 +2511,14 @@
         <w:suppressLineNumbers w:val="0"/>
         <w:spacing w:before="0" w:beforeAutospacing="1" w:after="0" w:afterAutospacing="1"/>
         <w:ind w:left="1560" w:leftChars="0" w:hanging="360"/>
-      </w:pPr>
-      <w:r>
+        <w:rPr>
+          <w:rFonts w:hint="default" w:ascii="Times New Roman" w:hAnsi="Times New Roman" w:cs="Times New Roman"/>
+        </w:rPr>
+      </w:pPr>
+      <w:r>
+        <w:rPr>
+          <w:rFonts w:hint="default" w:ascii="Times New Roman" w:hAnsi="Times New Roman" w:cs="Times New Roman"/>
+        </w:rPr>
         <w:t xml:space="preserve">Sao kê chuyển khoản. </w:t>
       </w:r>
     </w:p>
@@ -2012,8 +2534,14 @@
         <w:suppressLineNumbers w:val="0"/>
         <w:spacing w:before="0" w:beforeAutospacing="1" w:after="0" w:afterAutospacing="1"/>
         <w:ind w:left="1560" w:leftChars="0" w:hanging="360"/>
-      </w:pPr>
-      <w:r>
+        <w:rPr>
+          <w:rFonts w:hint="default" w:ascii="Times New Roman" w:hAnsi="Times New Roman" w:cs="Times New Roman"/>
+        </w:rPr>
+      </w:pPr>
+      <w:r>
+        <w:rPr>
+          <w:rFonts w:hint="default" w:ascii="Times New Roman" w:hAnsi="Times New Roman" w:cs="Times New Roman"/>
+        </w:rPr>
         <w:t xml:space="preserve">Báo cáo giao dịch POS. </w:t>
       </w:r>
     </w:p>
@@ -2029,8 +2557,14 @@
         <w:suppressLineNumbers w:val="0"/>
         <w:spacing w:before="0" w:beforeAutospacing="1" w:after="0" w:afterAutospacing="1"/>
         <w:ind w:left="1560" w:leftChars="0" w:hanging="360"/>
-      </w:pPr>
-      <w:r>
+        <w:rPr>
+          <w:rFonts w:hint="default" w:ascii="Times New Roman" w:hAnsi="Times New Roman" w:cs="Times New Roman"/>
+        </w:rPr>
+      </w:pPr>
+      <w:r>
+        <w:rPr>
+          <w:rFonts w:hint="default" w:ascii="Times New Roman" w:hAnsi="Times New Roman" w:cs="Times New Roman"/>
+        </w:rPr>
         <w:t xml:space="preserve">Giao dịch mã QR hoặc ví điện tử. </w:t>
       </w:r>
     </w:p>
@@ -2047,10 +2581,13 @@
         <w:spacing w:before="0" w:beforeAutospacing="1" w:after="0" w:afterAutospacing="1"/>
         <w:ind w:left="1560" w:leftChars="0" w:hanging="360"/>
         <w:rPr>
-          <w:rFonts w:hint="default"/>
-        </w:rPr>
-      </w:pPr>
-      <w:r>
+          <w:rFonts w:hint="default" w:ascii="Times New Roman" w:hAnsi="Times New Roman" w:cs="Times New Roman"/>
+        </w:rPr>
+      </w:pPr>
+      <w:r>
+        <w:rPr>
+          <w:rFonts w:hint="default" w:ascii="Times New Roman" w:hAnsi="Times New Roman" w:cs="Times New Roman"/>
+        </w:rPr>
         <w:t>Phiếu thu và hóa đơn đã lập.</w:t>
       </w:r>
     </w:p>
@@ -2600,8 +3137,9 @@
     </w:p>
     <w:p>
       <w:pPr>
-        <w:pStyle w:val="12"/>
-        <w:numPr>
+        <w:pStyle w:val="13"/>
+        <w:numPr>
+          <w:ilvl w:val="0"/>
           <w:numId w:val="0"/>
         </w:numPr>
         <w:spacing w:after="120" w:line="240" w:lineRule="auto"/>
@@ -2623,7 +3161,7 @@
     </w:p>
     <w:p>
       <w:pPr>
-        <w:pStyle w:val="12"/>
+        <w:pStyle w:val="13"/>
         <w:numPr>
           <w:ilvl w:val="0"/>
           <w:numId w:val="3"/>
@@ -2934,7 +3472,7 @@
             </w14:solidFill>
           </w14:textFill>
         </w:rPr>
-        <w:t>Trước khi thu tiền, nhân viên phải cho bệnh nhân kiểm tra dịch vụ, số lượng, đơn giá, giảm giá, tiền cọc, số đã trả và số còn lại [3].</w:t>
+        <w:t>Trước khi thu tiền, nhân viên phải cho bệnh nhân kiểm tra dịch vụ, số lượng, đơn giá, giảm giá, tiền cọc, số đã trả và số còn lại.</w:t>
       </w:r>
     </w:p>
     <w:p>
@@ -3298,8 +3836,6 @@
         </w:rPr>
         <w:tab/>
       </w:r>
-      <w:bookmarkStart w:id="0" w:name="_GoBack"/>
-      <w:bookmarkEnd w:id="0"/>
       <w:r>
         <w:rPr>
           <w:rFonts w:hint="default" w:ascii="Times New Roman" w:hAnsi="Times New Roman" w:eastAsia="Calibri" w:cs="Times New Roman"/>
@@ -3464,6 +4000,7 @@
       <w:pPr>
         <w:keepLines/>
         <w:numPr>
+          <w:ilvl w:val="0"/>
           <w:numId w:val="0"/>
         </w:numPr>
         <w:spacing w:after="80" w:line="288" w:lineRule="auto"/>
@@ -3485,16 +4022,18 @@
       <w:pPr>
         <w:pStyle w:val="2"/>
         <w:rPr>
-          <w:color w:val="000000" w:themeColor="text1"/>
-          <w14:textFill>
-            <w14:solidFill>
-              <w14:schemeClr w14:val="tx1"/>
-            </w14:solidFill>
-          </w14:textFill>
-        </w:rPr>
-      </w:pPr>
-      <w:r>
-        <w:rPr>
+          <w:rFonts w:hint="default" w:ascii="Times New Roman" w:hAnsi="Times New Roman" w:cs="Times New Roman"/>
+          <w:color w:val="000000" w:themeColor="text1"/>
+          <w14:textFill>
+            <w14:solidFill>
+              <w14:schemeClr w14:val="tx1"/>
+            </w14:solidFill>
+          </w14:textFill>
+        </w:rPr>
+      </w:pPr>
+      <w:r>
+        <w:rPr>
+          <w:rFonts w:hint="default" w:ascii="Times New Roman" w:hAnsi="Times New Roman" w:cs="Times New Roman"/>
           <w:color w:val="000000" w:themeColor="text1"/>
           <w14:textFill>
             <w14:solidFill>
@@ -3509,232 +4048,300 @@
       <w:pPr>
         <w:spacing w:after="60"/>
         <w:ind w:left="288" w:hanging="288"/>
-      </w:pPr>
-      <w:r>
-        <w:rPr>
-          <w:rFonts w:ascii="Calibri" w:hAnsi="Calibri" w:eastAsia="Calibri"/>
+        <w:rPr>
+          <w:rFonts w:hint="default" w:ascii="Times New Roman" w:hAnsi="Times New Roman" w:cs="Times New Roman"/>
+        </w:rPr>
+      </w:pPr>
+      <w:r>
+        <w:rPr>
+          <w:rFonts w:hint="default" w:ascii="Times New Roman" w:hAnsi="Times New Roman" w:eastAsia="Calibri" w:cs="Times New Roman"/>
           <w:color w:val="202124"/>
           <w:sz w:val="19"/>
         </w:rPr>
         <w:t xml:space="preserve">[1] Quốc hội, Luật Khám bệnh, chữa bệnh số 15/2023/QH15, 2023. </w:t>
       </w:r>
       <w:r>
+        <w:rPr>
+          <w:rFonts w:hint="default" w:ascii="Times New Roman" w:hAnsi="Times New Roman" w:cs="Times New Roman"/>
+        </w:rPr>
         <w:fldChar w:fldCharType="begin"/>
       </w:r>
       <w:r>
-        <w:instrText xml:space="preserve"> HYPERLINK "https://vbpl.vn/van-ban/chi-tiet/luat-kham-benh-chua-benh-2023-so-15-2023-qh15--168125" \h </w:instrText>
-      </w:r>
-      <w:r>
+        <w:rPr>
+          <w:rFonts w:hint="default" w:ascii="Times New Roman" w:hAnsi="Times New Roman" w:cs="Times New Roman"/>
+        </w:rPr>
+        <w:instrText xml:space="preserve"> HYPERLINK "https://vbpl.vn/van-ban/chi-tiet/luat-kham-benh-chua-benh-2023-so-15-2023-qh15--168125" </w:instrText>
+      </w:r>
+      <w:r>
+        <w:rPr>
+          <w:rFonts w:hint="default" w:ascii="Times New Roman" w:hAnsi="Times New Roman" w:cs="Times New Roman"/>
+        </w:rPr>
         <w:fldChar w:fldCharType="separate"/>
       </w:r>
       <w:r>
         <w:rPr>
+          <w:rStyle w:val="9"/>
+          <w:rFonts w:hint="default" w:ascii="Times New Roman" w:hAnsi="Times New Roman" w:cs="Times New Roman"/>
+        </w:rPr>
+        <w:t>https://vbpl.vn/van-ban/chi-tiet/luat-kham-benh-chua-benh-2023-so-15-2023-qh15--168125</w:t>
+      </w:r>
+      <w:r>
+        <w:rPr>
+          <w:rFonts w:hint="default" w:ascii="Times New Roman" w:hAnsi="Times New Roman" w:cs="Times New Roman"/>
+        </w:rPr>
+        <w:fldChar w:fldCharType="end"/>
+      </w:r>
+    </w:p>
+    <w:p>
+      <w:pPr>
+        <w:spacing w:after="60"/>
+        <w:ind w:left="288" w:hanging="288"/>
+        <w:rPr>
+          <w:rFonts w:hint="default" w:ascii="Times New Roman" w:hAnsi="Times New Roman" w:cs="Times New Roman"/>
+        </w:rPr>
+      </w:pPr>
+      <w:r>
+        <w:rPr>
+          <w:rFonts w:hint="default" w:ascii="Times New Roman" w:hAnsi="Times New Roman" w:eastAsia="Calibri" w:cs="Times New Roman"/>
+          <w:color w:val="202124"/>
+          <w:sz w:val="19"/>
+        </w:rPr>
+        <w:t xml:space="preserve">[2] Peace Dentistry, Bảng giá nha khoa năm 2026, truy cập ngày 18/08/2026. </w:t>
+      </w:r>
+      <w:r>
+        <w:rPr>
+          <w:rFonts w:hint="default" w:ascii="Times New Roman" w:hAnsi="Times New Roman" w:cs="Times New Roman"/>
+        </w:rPr>
+        <w:fldChar w:fldCharType="begin"/>
+      </w:r>
+      <w:r>
+        <w:rPr>
+          <w:rFonts w:hint="default" w:ascii="Times New Roman" w:hAnsi="Times New Roman" w:cs="Times New Roman"/>
+        </w:rPr>
+        <w:instrText xml:space="preserve"> HYPERLINK "https://nhakhoapeace.com/bang-gia/" </w:instrText>
+      </w:r>
+      <w:r>
+        <w:rPr>
+          <w:rFonts w:hint="default" w:ascii="Times New Roman" w:hAnsi="Times New Roman" w:cs="Times New Roman"/>
+        </w:rPr>
+        <w:fldChar w:fldCharType="separate"/>
+      </w:r>
+      <w:r>
+        <w:rPr>
+          <w:rStyle w:val="9"/>
+          <w:rFonts w:hint="default" w:ascii="Times New Roman" w:hAnsi="Times New Roman" w:cs="Times New Roman"/>
+        </w:rPr>
+        <w:t>https://nhakhoapeace.com/bang-gia/</w:t>
+      </w:r>
+      <w:r>
+        <w:rPr>
+          <w:rFonts w:hint="default" w:ascii="Times New Roman" w:hAnsi="Times New Roman" w:cs="Times New Roman"/>
+        </w:rPr>
+        <w:fldChar w:fldCharType="end"/>
+      </w:r>
+    </w:p>
+    <w:p>
+      <w:pPr>
+        <w:spacing w:after="60"/>
+        <w:ind w:left="288" w:hanging="288"/>
+        <w:rPr>
+          <w:rFonts w:hint="default" w:ascii="Times New Roman" w:hAnsi="Times New Roman" w:cs="Times New Roman"/>
+        </w:rPr>
+      </w:pPr>
+      <w:r>
+        <w:rPr>
+          <w:rFonts w:hint="default" w:ascii="Times New Roman" w:hAnsi="Times New Roman" w:eastAsia="Calibri" w:cs="Times New Roman"/>
+          <w:color w:val="202124"/>
+          <w:sz w:val="19"/>
+        </w:rPr>
+        <w:t>[</w:t>
+      </w:r>
+      <w:r>
+        <w:rPr>
+          <w:rFonts w:hint="default" w:ascii="Times New Roman" w:hAnsi="Times New Roman" w:eastAsia="Calibri" w:cs="Times New Roman"/>
+          <w:color w:val="202124"/>
+          <w:sz w:val="19"/>
+          <w:lang w:val="en-US"/>
+        </w:rPr>
+        <w:t>3</w:t>
+      </w:r>
+      <w:r>
+        <w:rPr>
+          <w:rFonts w:hint="default" w:ascii="Times New Roman" w:hAnsi="Times New Roman" w:eastAsia="Calibri" w:cs="Times New Roman"/>
+          <w:color w:val="202124"/>
+          <w:sz w:val="19"/>
+        </w:rPr>
+        <w:t xml:space="preserve">] Chính phủ, Nghị định số 123/2020/NĐ-CP về hóa đơn, chứng từ, 2020. </w:t>
+      </w:r>
+      <w:r>
+        <w:rPr>
+          <w:rFonts w:hint="default" w:ascii="Times New Roman" w:hAnsi="Times New Roman" w:cs="Times New Roman"/>
+        </w:rPr>
+        <w:fldChar w:fldCharType="begin"/>
+      </w:r>
+      <w:r>
+        <w:rPr>
+          <w:rFonts w:hint="default" w:ascii="Times New Roman" w:hAnsi="Times New Roman" w:cs="Times New Roman"/>
+        </w:rPr>
+        <w:instrText xml:space="preserve"> HYPERLINK "https://congbao.chinhphu.vn/van-ban/nghi-dinh-so-123-2020-nd-cp-32290/32999.htm" </w:instrText>
+      </w:r>
+      <w:r>
+        <w:rPr>
+          <w:rFonts w:hint="default" w:ascii="Times New Roman" w:hAnsi="Times New Roman" w:cs="Times New Roman"/>
+        </w:rPr>
+        <w:fldChar w:fldCharType="separate"/>
+      </w:r>
+      <w:r>
+        <w:rPr>
+          <w:rStyle w:val="9"/>
+          <w:rFonts w:hint="default" w:ascii="Times New Roman" w:hAnsi="Times New Roman" w:cs="Times New Roman"/>
+        </w:rPr>
+        <w:t>https://congbao.chinhphu.vn/van-ban/nghi-dinh-so-123-2020-nd-cp-32290/32999.htm</w:t>
+      </w:r>
+      <w:r>
+        <w:rPr>
+          <w:rFonts w:hint="default" w:ascii="Times New Roman" w:hAnsi="Times New Roman" w:cs="Times New Roman"/>
+        </w:rPr>
+        <w:fldChar w:fldCharType="end"/>
+      </w:r>
+    </w:p>
+    <w:p>
+      <w:pPr>
+        <w:spacing w:after="60"/>
+        <w:ind w:left="288" w:hanging="288"/>
+        <w:rPr>
+          <w:rFonts w:hint="default" w:ascii="Times New Roman" w:hAnsi="Times New Roman" w:cs="Times New Roman"/>
+        </w:rPr>
+      </w:pPr>
+      <w:r>
+        <w:rPr>
+          <w:rFonts w:hint="default" w:ascii="Times New Roman" w:hAnsi="Times New Roman" w:eastAsia="Calibri" w:cs="Times New Roman"/>
+          <w:color w:val="202124"/>
+          <w:sz w:val="19"/>
+        </w:rPr>
+        <w:t>[</w:t>
+      </w:r>
+      <w:r>
+        <w:rPr>
+          <w:rFonts w:hint="default" w:ascii="Times New Roman" w:hAnsi="Times New Roman" w:eastAsia="Calibri" w:cs="Times New Roman"/>
+          <w:color w:val="202124"/>
+          <w:sz w:val="19"/>
+          <w:lang w:val="en-US"/>
+        </w:rPr>
+        <w:t>4</w:t>
+      </w:r>
+      <w:r>
+        <w:rPr>
+          <w:rFonts w:hint="default" w:ascii="Times New Roman" w:hAnsi="Times New Roman" w:eastAsia="Calibri" w:cs="Times New Roman"/>
+          <w:color w:val="202124"/>
+          <w:sz w:val="19"/>
+        </w:rPr>
+        <w:t xml:space="preserve">] Chính phủ, Nghị định số 70/2025/NĐ-CP sửa đổi Nghị định số 123/2020/NĐ-CP, 2025. </w:t>
+      </w:r>
+      <w:r>
+        <w:rPr>
+          <w:rFonts w:hint="default" w:ascii="Times New Roman" w:hAnsi="Times New Roman" w:cs="Times New Roman"/>
+        </w:rPr>
+        <w:fldChar w:fldCharType="begin"/>
+      </w:r>
+      <w:r>
+        <w:rPr>
+          <w:rFonts w:hint="default" w:ascii="Times New Roman" w:hAnsi="Times New Roman" w:cs="Times New Roman"/>
+        </w:rPr>
+        <w:instrText xml:space="preserve"> HYPERLINK "https://congbao.chinhphu.vn/van-ban/nghi-dinh-so-70-2025-nd-cp-44623/55799.htm" </w:instrText>
+      </w:r>
+      <w:r>
+        <w:rPr>
+          <w:rFonts w:hint="default" w:ascii="Times New Roman" w:hAnsi="Times New Roman" w:cs="Times New Roman"/>
+        </w:rPr>
+        <w:fldChar w:fldCharType="separate"/>
+      </w:r>
+      <w:r>
+        <w:rPr>
+          <w:rStyle w:val="9"/>
+          <w:rFonts w:hint="default" w:ascii="Times New Roman" w:hAnsi="Times New Roman" w:cs="Times New Roman"/>
+        </w:rPr>
+        <w:t>https://congbao.chinhphu.vn/van-ban/nghi-dinh-so-70-2025-nd-cp-44623/55799.htm</w:t>
+      </w:r>
+      <w:r>
+        <w:rPr>
+          <w:rFonts w:hint="default" w:ascii="Times New Roman" w:hAnsi="Times New Roman" w:cs="Times New Roman"/>
+        </w:rPr>
+        <w:fldChar w:fldCharType="end"/>
+      </w:r>
+    </w:p>
+    <w:p>
+      <w:pPr>
+        <w:spacing w:after="60"/>
+        <w:ind w:left="288" w:hanging="288"/>
+        <w:rPr>
+          <w:rFonts w:hint="default" w:ascii="Times New Roman" w:hAnsi="Times New Roman" w:cs="Times New Roman"/>
           <w:color w:val="2E74B5"/>
           <w:u w:val="single"/>
         </w:rPr>
-        <w:t>https://vbpl.vn/van-ban/chi-tiet/luat-kham-benh-chua-benh-2023-so-15-2023-qh15--168125</w:t>
-      </w:r>
-      <w:r>
-        <w:rPr>
-          <w:color w:val="2E74B5"/>
-          <w:u w:val="single"/>
-        </w:rPr>
-        <w:fldChar w:fldCharType="end"/>
-      </w:r>
-    </w:p>
-    <w:p>
-      <w:pPr>
-        <w:spacing w:after="60"/>
-        <w:ind w:left="288" w:hanging="288"/>
-      </w:pPr>
-      <w:r>
-        <w:rPr>
-          <w:rFonts w:ascii="Calibri" w:hAnsi="Calibri" w:eastAsia="Calibri"/>
+      </w:pPr>
+      <w:r>
+        <w:rPr>
+          <w:rFonts w:hint="default" w:ascii="Times New Roman" w:hAnsi="Times New Roman" w:eastAsia="Calibri" w:cs="Times New Roman"/>
           <w:color w:val="202124"/>
           <w:sz w:val="19"/>
         </w:rPr>
-        <w:t xml:space="preserve">[2] Peace Dentistry, Bảng giá nha khoa năm 2026, truy cập ngày 18/08/2026. </w:t>
-      </w:r>
-      <w:r>
-        <w:fldChar w:fldCharType="begin"/>
-      </w:r>
-      <w:r>
-        <w:instrText xml:space="preserve"> HYPERLINK "https://nhakhoapeace.com/bang-gia/" \h </w:instrText>
-      </w:r>
-      <w:r>
-        <w:fldChar w:fldCharType="separate"/>
-      </w:r>
-      <w:r>
-        <w:rPr>
-          <w:color w:val="2E74B5"/>
-          <w:u w:val="single"/>
-        </w:rPr>
-        <w:t>https://nhakhoapeace.com/bang-gia/</w:t>
-      </w:r>
-      <w:r>
-        <w:rPr>
-          <w:color w:val="2E74B5"/>
-          <w:u w:val="single"/>
-        </w:rPr>
-        <w:fldChar w:fldCharType="end"/>
-      </w:r>
-    </w:p>
-    <w:p>
-      <w:pPr>
-        <w:spacing w:after="60"/>
-        <w:ind w:left="288" w:hanging="288"/>
-      </w:pPr>
-      <w:r>
-        <w:rPr>
-          <w:rFonts w:ascii="Calibri" w:hAnsi="Calibri" w:eastAsia="Calibri"/>
+        <w:t>[</w:t>
+      </w:r>
+      <w:r>
+        <w:rPr>
+          <w:rFonts w:hint="default" w:ascii="Times New Roman" w:hAnsi="Times New Roman" w:eastAsia="Calibri" w:cs="Times New Roman"/>
           <w:color w:val="202124"/>
           <w:sz w:val="19"/>
-        </w:rPr>
-        <w:t xml:space="preserve">[3] Quốc hội, Luật Bảo vệ quyền lợi người tiêu dùng số 19/2023/QH15, 2023. </w:t>
-      </w:r>
-      <w:r>
-        <w:fldChar w:fldCharType="begin"/>
-      </w:r>
-      <w:r>
-        <w:instrText xml:space="preserve"> HYPERLINK "https://chinhphu.vn/?classid=1&amp;docid=208363&amp;pageid=27160&amp;typegroupid=3" \h </w:instrText>
-      </w:r>
-      <w:r>
-        <w:fldChar w:fldCharType="separate"/>
-      </w:r>
-      <w:r>
-        <w:rPr>
-          <w:color w:val="2E74B5"/>
-          <w:u w:val="single"/>
-        </w:rPr>
-        <w:t>https://chinhphu.vn/?classid=1&amp;docid=208363&amp;pageid=27160&amp;typegroupid=3</w:t>
-      </w:r>
-      <w:r>
-        <w:rPr>
-          <w:color w:val="2E74B5"/>
-          <w:u w:val="single"/>
-        </w:rPr>
-        <w:fldChar w:fldCharType="end"/>
-      </w:r>
-    </w:p>
-    <w:p>
-      <w:pPr>
-        <w:spacing w:after="60"/>
-        <w:ind w:left="288" w:hanging="288"/>
-      </w:pPr>
-      <w:r>
-        <w:rPr>
-          <w:rFonts w:ascii="Calibri" w:hAnsi="Calibri" w:eastAsia="Calibri"/>
+          <w:lang w:val="en-US"/>
+        </w:rPr>
+        <w:t>5</w:t>
+      </w:r>
+      <w:r>
+        <w:rPr>
+          <w:rFonts w:hint="default" w:ascii="Times New Roman" w:hAnsi="Times New Roman" w:eastAsia="Calibri" w:cs="Times New Roman"/>
           <w:color w:val="202124"/>
           <w:sz w:val="19"/>
         </w:rPr>
-        <w:t xml:space="preserve">[4] Chính phủ, Nghị định số 123/2020/NĐ-CP về hóa đơn, chứng từ, 2020. </w:t>
-      </w:r>
-      <w:r>
+        <w:t xml:space="preserve">] Quốc hội, Luật Thuế giá trị gia tăng số 48/2024/QH15, 2024. </w:t>
+      </w:r>
+      <w:r>
+        <w:rPr>
+          <w:rFonts w:hint="default" w:ascii="Times New Roman" w:hAnsi="Times New Roman" w:cs="Times New Roman"/>
+        </w:rPr>
         <w:fldChar w:fldCharType="begin"/>
       </w:r>
       <w:r>
-        <w:instrText xml:space="preserve"> HYPERLINK "https://congbao.chinhphu.vn/van-ban/nghi-dinh-so-123-2020-nd-cp-32290/32999.htm" \h </w:instrText>
-      </w:r>
-      <w:r>
+        <w:rPr>
+          <w:rFonts w:hint="default" w:ascii="Times New Roman" w:hAnsi="Times New Roman" w:cs="Times New Roman"/>
+        </w:rPr>
+        <w:instrText xml:space="preserve"> HYPERLINK "https://vanban.chinhphu.vn/?docid=212476&amp;pageid=27160" </w:instrText>
+      </w:r>
+      <w:r>
+        <w:rPr>
+          <w:rFonts w:hint="default" w:ascii="Times New Roman" w:hAnsi="Times New Roman" w:cs="Times New Roman"/>
+        </w:rPr>
         <w:fldChar w:fldCharType="separate"/>
       </w:r>
       <w:r>
         <w:rPr>
-          <w:color w:val="2E74B5"/>
-          <w:u w:val="single"/>
-        </w:rPr>
-        <w:t>https://congbao.chinhphu.vn/van-ban/nghi-dinh-so-123-2020-nd-cp-32290/32999.htm</w:t>
-      </w:r>
-      <w:r>
-        <w:rPr>
-          <w:color w:val="2E74B5"/>
-          <w:u w:val="single"/>
+          <w:rStyle w:val="9"/>
+          <w:rFonts w:hint="default" w:ascii="Times New Roman" w:hAnsi="Times New Roman" w:cs="Times New Roman"/>
+        </w:rPr>
+        <w:t>https://vanban.chinhphu.vn/?docid=212476&amp;pageid=27160</w:t>
+      </w:r>
+      <w:r>
+        <w:rPr>
+          <w:rFonts w:hint="default" w:ascii="Times New Roman" w:hAnsi="Times New Roman" w:cs="Times New Roman"/>
         </w:rPr>
         <w:fldChar w:fldCharType="end"/>
       </w:r>
     </w:p>
     <w:p>
       <w:pPr>
-        <w:spacing w:after="60"/>
-        <w:ind w:left="288" w:hanging="288"/>
-      </w:pPr>
-      <w:r>
-        <w:rPr>
-          <w:rFonts w:ascii="Calibri" w:hAnsi="Calibri" w:eastAsia="Calibri"/>
-          <w:color w:val="202124"/>
-          <w:sz w:val="19"/>
-        </w:rPr>
-        <w:t xml:space="preserve">[5] Chính phủ, Nghị định số 70/2025/NĐ-CP sửa đổi Nghị định số 123/2020/NĐ-CP, 2025. </w:t>
-      </w:r>
-      <w:r>
-        <w:fldChar w:fldCharType="begin"/>
-      </w:r>
-      <w:r>
-        <w:instrText xml:space="preserve"> HYPERLINK "https://congbao.chinhphu.vn/van-ban/nghi-dinh-so-70-2025-nd-cp-44623/55799.htm" \h </w:instrText>
-      </w:r>
-      <w:r>
-        <w:fldChar w:fldCharType="separate"/>
-      </w:r>
-      <w:r>
-        <w:rPr>
-          <w:color w:val="2E74B5"/>
-          <w:u w:val="single"/>
-        </w:rPr>
-        <w:t>https://congbao.chinhphu.vn/van-ban/nghi-dinh-so-70-2025-nd-cp-44623/55799.htm</w:t>
-      </w:r>
-      <w:r>
-        <w:rPr>
-          <w:color w:val="2E74B5"/>
-          <w:u w:val="single"/>
-        </w:rPr>
-        <w:fldChar w:fldCharType="end"/>
-      </w:r>
-    </w:p>
-    <w:p>
-      <w:pPr>
-        <w:spacing w:after="60"/>
-        <w:ind w:left="288" w:hanging="288"/>
-        <w:rPr>
-          <w:color w:val="2E74B5"/>
-          <w:u w:val="single"/>
-        </w:rPr>
-      </w:pPr>
-      <w:r>
-        <w:rPr>
-          <w:rFonts w:ascii="Calibri" w:hAnsi="Calibri" w:eastAsia="Calibri"/>
-          <w:color w:val="202124"/>
-          <w:sz w:val="19"/>
-        </w:rPr>
-        <w:t xml:space="preserve">[6] Quốc hội, Luật Thuế giá trị gia tăng số 48/2024/QH15, 2024. </w:t>
-      </w:r>
-      <w:r>
-        <w:fldChar w:fldCharType="begin"/>
-      </w:r>
-      <w:r>
-        <w:instrText xml:space="preserve"> HYPERLINK "https://vanban.chinhphu.vn/?docid=212476&amp;pageid=27160" \h </w:instrText>
-      </w:r>
-      <w:r>
-        <w:fldChar w:fldCharType="separate"/>
-      </w:r>
-      <w:r>
-        <w:rPr>
-          <w:color w:val="2E74B5"/>
-          <w:u w:val="single"/>
-        </w:rPr>
-        <w:t>https://vanban.chinhphu.vn/?docid=212476&amp;pageid=27160</w:t>
-      </w:r>
-      <w:r>
-        <w:rPr>
-          <w:color w:val="2E74B5"/>
-          <w:u w:val="single"/>
-        </w:rPr>
-        <w:fldChar w:fldCharType="end"/>
-      </w:r>
-    </w:p>
-    <w:p>
-      <w:pPr>
         <w:keepLines/>
         <w:numPr>
+          <w:ilvl w:val="0"/>
           <w:numId w:val="0"/>
         </w:numPr>
         <w:spacing w:after="80" w:line="288" w:lineRule="auto"/>
@@ -3754,8 +4361,9 @@
     </w:p>
     <w:p>
       <w:pPr>
-        <w:pStyle w:val="12"/>
-        <w:numPr>
+        <w:pStyle w:val="13"/>
+        <w:numPr>
+          <w:ilvl w:val="0"/>
           <w:numId w:val="0"/>
         </w:numPr>
         <w:spacing w:after="120" w:line="240" w:lineRule="auto"/>
@@ -3777,7 +4385,7 @@
     </w:p>
     <w:p>
       <w:pPr>
-        <w:pStyle w:val="12"/>
+        <w:pStyle w:val="13"/>
         <w:spacing w:after="120" w:line="240" w:lineRule="auto"/>
         <w:ind w:left="284"/>
         <w:jc w:val="both"/>
@@ -3797,7 +4405,7 @@
     </w:p>
     <w:p>
       <w:pPr>
-        <w:pStyle w:val="12"/>
+        <w:pStyle w:val="13"/>
         <w:numPr>
           <w:ilvl w:val="0"/>
           <w:numId w:val="2"/>
@@ -3824,7 +4432,7 @@
     </w:p>
     <w:tbl>
       <w:tblPr>
-        <w:tblStyle w:val="11"/>
+        <w:tblStyle w:val="12"/>
         <w:tblW w:w="5000" w:type="pct"/>
         <w:tblInd w:w="0" w:type="dxa"/>
         <w:tblBorders>
@@ -4562,12 +5170,6 @@
             <w:insideH w:val="single" w:color="auto" w:sz="4" w:space="0"/>
             <w:insideV w:val="single" w:color="auto" w:sz="4" w:space="0"/>
           </w:tblBorders>
-          <w:tblCellMar>
-            <w:top w:w="0" w:type="dxa"/>
-            <w:left w:w="108" w:type="dxa"/>
-            <w:bottom w:w="0" w:type="dxa"/>
-            <w:right w:w="108" w:type="dxa"/>
-          </w:tblCellMar>
         </w:tblPrEx>
         <w:trPr>
           <w:trHeight w:val="339" w:hRule="atLeast"/>
@@ -4847,12 +5449,6 @@
             <w:insideH w:val="single" w:color="auto" w:sz="4" w:space="0"/>
             <w:insideV w:val="single" w:color="auto" w:sz="4" w:space="0"/>
           </w:tblBorders>
-          <w:tblCellMar>
-            <w:top w:w="0" w:type="dxa"/>
-            <w:left w:w="108" w:type="dxa"/>
-            <w:bottom w:w="0" w:type="dxa"/>
-            <w:right w:w="108" w:type="dxa"/>
-          </w:tblCellMar>
         </w:tblPrEx>
         <w:trPr>
           <w:trHeight w:val="339" w:hRule="atLeast"/>
@@ -4946,7 +5542,7 @@
     </w:p>
     <w:p>
       <w:pPr>
-        <w:pStyle w:val="12"/>
+        <w:pStyle w:val="13"/>
         <w:numPr>
           <w:ilvl w:val="0"/>
           <w:numId w:val="2"/>
@@ -4985,7 +5581,7 @@
     </w:p>
     <w:p>
       <w:pPr>
-        <w:pStyle w:val="12"/>
+        <w:pStyle w:val="13"/>
         <w:numPr>
           <w:ilvl w:val="0"/>
           <w:numId w:val="2"/>
@@ -5012,7 +5608,7 @@
     </w:p>
     <w:p>
       <w:pPr>
-        <w:pStyle w:val="12"/>
+        <w:pStyle w:val="13"/>
         <w:spacing w:after="120" w:line="240" w:lineRule="auto"/>
         <w:ind w:left="284"/>
         <w:jc w:val="both"/>
@@ -5026,7 +5622,7 @@
     </w:p>
     <w:p>
       <w:pPr>
-        <w:pStyle w:val="12"/>
+        <w:pStyle w:val="13"/>
         <w:numPr>
           <w:ilvl w:val="0"/>
           <w:numId w:val="2"/>
@@ -5051,7 +5647,7 @@
     </w:p>
     <w:p>
       <w:pPr>
-        <w:pStyle w:val="12"/>
+        <w:pStyle w:val="13"/>
         <w:spacing w:after="120" w:line="240" w:lineRule="auto"/>
         <w:ind w:left="284"/>
         <w:jc w:val="both"/>
@@ -5154,7 +5750,7 @@
       </w:rPr>
       <w:id w:val="222028448"/>
       <w:docPartObj>
-        <w:docPartGallery w:val="AutoText"/>
+        <w:docPartGallery w:val="autotext"/>
       </w:docPartObj>
     </w:sdtPr>
     <w:sdtEndPr>
@@ -6929,7 +7525,7 @@
     <w:lsdException w:uiPriority="99" w:name="Table Web 2"/>
     <w:lsdException w:uiPriority="99" w:name="Table Web 3"/>
     <w:lsdException w:uiPriority="99" w:name="Balloon Text"/>
-    <w:lsdException w:unhideWhenUsed="0" w:uiPriority="39" w:semiHidden="0" w:name="Table Grid"/>
+    <w:lsdException w:qFormat="1" w:unhideWhenUsed="0" w:uiPriority="39" w:semiHidden="0" w:name="Table Grid"/>
     <w:lsdException w:uiPriority="99" w:name="Table Theme"/>
     <w:lsdException w:unhideWhenUsed="0" w:uiPriority="60" w:semiHidden="0" w:name="Light Shading"/>
     <w:lsdException w:unhideWhenUsed="0" w:uiPriority="61" w:semiHidden="0" w:name="Light List"/>
@@ -7133,7 +7729,7 @@
   <w:style w:type="paragraph" w:styleId="7">
     <w:name w:val="footer"/>
     <w:basedOn w:val="1"/>
-    <w:link w:val="14"/>
+    <w:link w:val="15"/>
     <w:unhideWhenUsed/>
     <w:qFormat/>
     <w:uiPriority w:val="99"/>
@@ -7148,7 +7744,7 @@
   <w:style w:type="paragraph" w:styleId="8">
     <w:name w:val="header"/>
     <w:basedOn w:val="1"/>
-    <w:link w:val="13"/>
+    <w:link w:val="14"/>
     <w:unhideWhenUsed/>
     <w:qFormat/>
     <w:uiPriority w:val="99"/>
@@ -7160,7 +7756,18 @@
       <w:spacing w:after="0" w:line="240" w:lineRule="auto"/>
     </w:pPr>
   </w:style>
-  <w:style w:type="paragraph" w:styleId="9">
+  <w:style w:type="character" w:styleId="9">
+    <w:name w:val="Hyperlink"/>
+    <w:basedOn w:val="5"/>
+    <w:semiHidden/>
+    <w:unhideWhenUsed/>
+    <w:uiPriority w:val="99"/>
+    <w:rPr>
+      <w:color w:val="0000FF"/>
+      <w:u w:val="single"/>
+    </w:rPr>
+  </w:style>
+  <w:style w:type="paragraph" w:styleId="10">
     <w:name w:val="Normal (Web)"/>
     <w:semiHidden/>
     <w:unhideWhenUsed/>
@@ -7171,13 +7778,14 @@
       <w:jc w:val="left"/>
     </w:pPr>
     <w:rPr>
+      <w:rFonts w:ascii="Times New Roman" w:hAnsi="Times New Roman" w:eastAsia="SimSun" w:cs="Times New Roman"/>
       <w:kern w:val="0"/>
       <w:sz w:val="24"/>
       <w:szCs w:val="24"/>
       <w:lang w:val="en-US" w:eastAsia="zh-CN" w:bidi="ar"/>
     </w:rPr>
   </w:style>
-  <w:style w:type="character" w:styleId="10">
+  <w:style w:type="character" w:styleId="11">
     <w:name w:val="Strong"/>
     <w:basedOn w:val="5"/>
     <w:qFormat/>
@@ -7187,9 +7795,10 @@
       <w:bCs/>
     </w:rPr>
   </w:style>
-  <w:style w:type="table" w:styleId="11">
+  <w:style w:type="table" w:styleId="12">
     <w:name w:val="Table Grid"/>
     <w:basedOn w:val="6"/>
+    <w:qFormat/>
     <w:uiPriority w:val="39"/>
     <w:pPr>
       <w:spacing w:after="0" w:line="240" w:lineRule="auto"/>
@@ -7205,7 +7814,7 @@
       </w:tblBorders>
     </w:tblPr>
   </w:style>
-  <w:style w:type="paragraph" w:styleId="12">
+  <w:style w:type="paragraph" w:styleId="13">
     <w:name w:val="List Paragraph"/>
     <w:basedOn w:val="1"/>
     <w:qFormat/>
@@ -7215,17 +7824,18 @@
       <w:contextualSpacing/>
     </w:pPr>
   </w:style>
-  <w:style w:type="character" w:customStyle="1" w:styleId="13">
+  <w:style w:type="character" w:customStyle="1" w:styleId="14">
     <w:name w:val="Header Char"/>
     <w:basedOn w:val="5"/>
     <w:link w:val="8"/>
     <w:qFormat/>
     <w:uiPriority w:val="99"/>
   </w:style>
-  <w:style w:type="character" w:customStyle="1" w:styleId="14">
+  <w:style w:type="character" w:customStyle="1" w:styleId="15">
     <w:name w:val="Footer Char"/>
     <w:basedOn w:val="5"/>
     <w:link w:val="7"/>
+    <w:qFormat/>
     <w:uiPriority w:val="99"/>
   </w:style>
 </w:styles>

</xml_diff>